<commit_message>
more edits of reviewer comments, waiting to hear from diego
</commit_message>
<xml_diff>
--- a/Docs/ICES_JMS/R1/R1_ResponseToReviewers.docx
+++ b/Docs/ICES_JMS/R1/R1_ResponseToReviewers.docx
@@ -1571,13 +1571,7 @@
         <w:rPr>
           <w:rFonts w:asciiTheme="majorHAnsi" w:hAnsiTheme="majorHAnsi"/>
         </w:rPr>
-        <w:t xml:space="preserve"> </w:t>
-      </w:r>
-      <w:r>
-        <w:rPr>
-          <w:rFonts w:asciiTheme="majorHAnsi" w:hAnsiTheme="majorHAnsi"/>
-        </w:rPr>
-        <w:t>In</w:t>
+        <w:t xml:space="preserve"> In</w:t>
       </w:r>
       <w:proofErr w:type="gramEnd"/>
       <w:r>
@@ -1598,13 +1592,7 @@
         <w:rPr>
           <w:rFonts w:asciiTheme="majorHAnsi" w:hAnsiTheme="majorHAnsi"/>
         </w:rPr>
-        <w:t xml:space="preserve"> methods that are not flexible enough to handle complex multidimension relationships in the data beyond those indicated from principal component analysis</w:t>
-      </w:r>
-      <w:r>
-        <w:rPr>
-          <w:rFonts w:asciiTheme="majorHAnsi" w:hAnsiTheme="majorHAnsi"/>
-        </w:rPr>
-        <w:t xml:space="preserve"> “</w:t>
+        <w:t xml:space="preserve"> methods that are not flexible enough to handle complex multidimension relationships in the data beyond those indicated from principal component analysis “</w:t>
       </w:r>
     </w:p>
     <w:p>
@@ -1926,43 +1914,425 @@
         <w:rPr>
           <w:rFonts w:asciiTheme="majorHAnsi" w:hAnsiTheme="majorHAnsi" w:cs="Times New Roman"/>
         </w:rPr>
-        <w:t xml:space="preserve"> resulting in a more pronounced impact to class- specific accuracy from misassignment to relatively few individuals.</w:t>
-      </w:r>
-      <w:r>
+        <w:t xml:space="preserve"> resulting in a more pronounced impact to class- specific accuracy from misassignment to relatively few individuals.” </w:t>
+      </w:r>
+    </w:p>
+    <w:p>
+      <w:pPr>
+        <w:rPr>
+          <w:rFonts w:asciiTheme="majorHAnsi" w:hAnsiTheme="majorHAnsi" w:cs="Arial"/>
+          <w:color w:val="222222"/>
+          <w:shd w:val="clear" w:color="auto" w:fill="FFFFFF"/>
+        </w:rPr>
+      </w:pPr>
+    </w:p>
+    <w:p>
+      <w:pPr>
+        <w:rPr>
+          <w:rFonts w:asciiTheme="majorHAnsi" w:hAnsiTheme="majorHAnsi" w:cs="Arial"/>
+          <w:b/>
+          <w:bCs/>
+          <w:color w:val="222222"/>
+          <w:shd w:val="clear" w:color="auto" w:fill="FFFFFF"/>
+        </w:rPr>
+      </w:pPr>
+      <w:r>
+        <w:rPr>
+          <w:rFonts w:asciiTheme="majorHAnsi" w:hAnsiTheme="majorHAnsi" w:cs="Arial"/>
+          <w:b/>
+          <w:bCs/>
+          <w:color w:val="222222"/>
+          <w:shd w:val="clear" w:color="auto" w:fill="FFFFFF"/>
+        </w:rPr>
+        <w:t>Line 331, re: “(ex. Supp. Figure 1</w:t>
+      </w:r>
+      <w:proofErr w:type="gramStart"/>
+      <w:r>
+        <w:rPr>
+          <w:rFonts w:asciiTheme="majorHAnsi" w:hAnsiTheme="majorHAnsi" w:cs="Arial"/>
+          <w:b/>
+          <w:bCs/>
+          <w:color w:val="222222"/>
+          <w:shd w:val="clear" w:color="auto" w:fill="FFFFFF"/>
+        </w:rPr>
+        <w:t>)”  -</w:t>
+      </w:r>
+      <w:proofErr w:type="gramEnd"/>
+      <w:r>
+        <w:rPr>
+          <w:rFonts w:asciiTheme="majorHAnsi" w:hAnsiTheme="majorHAnsi" w:cs="Arial"/>
+          <w:b/>
+          <w:bCs/>
+          <w:color w:val="222222"/>
+          <w:shd w:val="clear" w:color="auto" w:fill="FFFFFF"/>
+        </w:rPr>
+        <w:t xml:space="preserve">  I believe that you mean Supplemental Figure 2, yes?</w:t>
+      </w:r>
+    </w:p>
+    <w:p>
+      <w:pPr>
+        <w:rPr>
+          <w:rFonts w:asciiTheme="majorHAnsi" w:hAnsiTheme="majorHAnsi" w:cs="Arial"/>
+          <w:color w:val="222222"/>
+          <w:shd w:val="clear" w:color="auto" w:fill="FFFFFF"/>
+        </w:rPr>
+      </w:pPr>
+      <w:r>
+        <w:rPr>
+          <w:rFonts w:asciiTheme="majorHAnsi" w:hAnsiTheme="majorHAnsi" w:cs="Arial"/>
+          <w:color w:val="222222"/>
+          <w:shd w:val="clear" w:color="auto" w:fill="FFFFFF"/>
+        </w:rPr>
+        <w:t xml:space="preserve">Yes. Corrected to reference Supp. Figure 2 </w:t>
+      </w:r>
+    </w:p>
+    <w:p>
+      <w:pPr>
+        <w:rPr>
+          <w:rFonts w:asciiTheme="majorHAnsi" w:hAnsiTheme="majorHAnsi" w:cs="Arial"/>
+          <w:b/>
+          <w:bCs/>
+          <w:color w:val="222222"/>
+          <w:shd w:val="clear" w:color="auto" w:fill="FFFFFF"/>
+        </w:rPr>
+      </w:pPr>
+    </w:p>
+    <w:p>
+      <w:pPr>
+        <w:rPr>
+          <w:rFonts w:asciiTheme="majorHAnsi" w:hAnsiTheme="majorHAnsi" w:cs="Arial"/>
+          <w:b/>
+          <w:bCs/>
+          <w:color w:val="222222"/>
+          <w:shd w:val="clear" w:color="auto" w:fill="FFFFFF"/>
+        </w:rPr>
+      </w:pPr>
+      <w:r>
+        <w:rPr>
+          <w:rFonts w:asciiTheme="majorHAnsi" w:hAnsiTheme="majorHAnsi" w:cs="Arial"/>
+          <w:b/>
+          <w:bCs/>
+          <w:color w:val="222222"/>
+          <w:shd w:val="clear" w:color="auto" w:fill="FFFFFF"/>
+        </w:rPr>
+        <w:t>Line 331, re: “(ex. Supp. Figure 1</w:t>
+      </w:r>
+      <w:proofErr w:type="gramStart"/>
+      <w:r>
+        <w:rPr>
+          <w:rFonts w:asciiTheme="majorHAnsi" w:hAnsiTheme="majorHAnsi" w:cs="Arial"/>
+          <w:b/>
+          <w:bCs/>
+          <w:color w:val="222222"/>
+          <w:shd w:val="clear" w:color="auto" w:fill="FFFFFF"/>
+        </w:rPr>
+        <w:t>)”  -</w:t>
+      </w:r>
+      <w:proofErr w:type="gramEnd"/>
+      <w:r>
+        <w:rPr>
+          <w:rFonts w:asciiTheme="majorHAnsi" w:hAnsiTheme="majorHAnsi" w:cs="Arial"/>
+          <w:b/>
+          <w:bCs/>
+          <w:color w:val="222222"/>
+          <w:shd w:val="clear" w:color="auto" w:fill="FFFFFF"/>
+        </w:rPr>
+        <w:t xml:space="preserve">  I find this figure quite helpful to understanding the procedure.  As in, I would lobby for it to simply become Figure 6 … if the Editors do not protest.</w:t>
+      </w:r>
+    </w:p>
+    <w:p>
+      <w:pPr>
+        <w:rPr>
+          <w:rFonts w:asciiTheme="majorHAnsi" w:hAnsiTheme="majorHAnsi" w:cs="Arial"/>
+          <w:color w:val="000000" w:themeColor="text1"/>
+          <w:shd w:val="clear" w:color="auto" w:fill="FFFFFF"/>
+        </w:rPr>
+      </w:pPr>
+    </w:p>
+    <w:p>
+      <w:pPr>
+        <w:rPr>
+          <w:rFonts w:asciiTheme="majorHAnsi" w:hAnsiTheme="majorHAnsi" w:cs="Arial"/>
+          <w:color w:val="000000" w:themeColor="text1"/>
+          <w:shd w:val="clear" w:color="auto" w:fill="FFFFFF"/>
+        </w:rPr>
+      </w:pPr>
+      <w:r>
+        <w:rPr>
+          <w:rFonts w:asciiTheme="majorHAnsi" w:hAnsiTheme="majorHAnsi" w:cs="Arial"/>
+          <w:color w:val="000000" w:themeColor="text1"/>
+          <w:shd w:val="clear" w:color="auto" w:fill="FFFFFF"/>
+        </w:rPr>
+        <w:t>Although we appreciate the reviewer’s comments on this figure, we have opted to keep it as a supplemental figure to avoid adding excess length to this manuscript. There are already 6 figures, and this addition would make it a 7</w:t>
+      </w:r>
+      <w:r>
+        <w:rPr>
+          <w:rFonts w:asciiTheme="majorHAnsi" w:hAnsiTheme="majorHAnsi" w:cs="Arial"/>
+          <w:color w:val="000000" w:themeColor="text1"/>
+          <w:shd w:val="clear" w:color="auto" w:fill="FFFFFF"/>
+          <w:vertAlign w:val="superscript"/>
+        </w:rPr>
+        <w:t>th</w:t>
+      </w:r>
+      <w:r>
+        <w:rPr>
+          <w:rFonts w:asciiTheme="majorHAnsi" w:hAnsiTheme="majorHAnsi" w:cs="Arial"/>
+          <w:color w:val="000000" w:themeColor="text1"/>
+          <w:shd w:val="clear" w:color="auto" w:fill="FFFFFF"/>
+        </w:rPr>
+        <w:t xml:space="preserve">. </w:t>
+      </w:r>
+    </w:p>
+    <w:p>
+      <w:pPr>
+        <w:rPr>
+          <w:rFonts w:asciiTheme="majorHAnsi" w:hAnsiTheme="majorHAnsi" w:cs="Arial"/>
+          <w:b/>
+          <w:bCs/>
+          <w:color w:val="222222"/>
+          <w:shd w:val="clear" w:color="auto" w:fill="FFFFFF"/>
+        </w:rPr>
+      </w:pPr>
+    </w:p>
+    <w:p>
+      <w:pPr>
+        <w:rPr>
+          <w:rFonts w:asciiTheme="majorHAnsi" w:hAnsiTheme="majorHAnsi" w:cs="Arial"/>
+          <w:b/>
+          <w:bCs/>
+          <w:color w:val="222222"/>
+          <w:shd w:val="clear" w:color="auto" w:fill="FFFFFF"/>
+        </w:rPr>
+      </w:pPr>
+      <w:r>
+        <w:rPr>
+          <w:rFonts w:asciiTheme="majorHAnsi" w:hAnsiTheme="majorHAnsi" w:cs="Arial"/>
+          <w:b/>
+          <w:bCs/>
+          <w:color w:val="222222"/>
+          <w:shd w:val="clear" w:color="auto" w:fill="FFFFFF"/>
+        </w:rPr>
+        <w:t>Lines 333-334, re: “from 91 – 79% … and from 89.5% to 78</w:t>
+      </w:r>
+      <w:proofErr w:type="gramStart"/>
+      <w:r>
+        <w:rPr>
+          <w:rFonts w:asciiTheme="majorHAnsi" w:hAnsiTheme="majorHAnsi" w:cs="Arial"/>
+          <w:b/>
+          <w:bCs/>
+          <w:color w:val="222222"/>
+          <w:shd w:val="clear" w:color="auto" w:fill="FFFFFF"/>
+        </w:rPr>
+        <w:t>%”  -</w:t>
+      </w:r>
+      <w:proofErr w:type="gramEnd"/>
+      <w:r>
+        <w:rPr>
+          <w:rFonts w:asciiTheme="majorHAnsi" w:hAnsiTheme="majorHAnsi" w:cs="Arial"/>
+          <w:b/>
+          <w:bCs/>
+          <w:color w:val="222222"/>
+          <w:shd w:val="clear" w:color="auto" w:fill="FFFFFF"/>
+        </w:rPr>
+        <w:t xml:space="preserve">  Why two different formats within the same sentence, to indicate “to”?</w:t>
+      </w:r>
+    </w:p>
+    <w:p>
+      <w:pPr>
         <w:rPr>
           <w:rFonts w:asciiTheme="majorHAnsi" w:hAnsiTheme="majorHAnsi" w:cs="Times New Roman"/>
         </w:rPr>
-        <w:t xml:space="preserve">” </w:t>
-      </w:r>
-    </w:p>
-    <w:p>
-      <w:pPr>
-        <w:rPr>
-          <w:rFonts w:asciiTheme="majorHAnsi" w:hAnsiTheme="majorHAnsi" w:cs="Arial"/>
-          <w:color w:val="222222"/>
-          <w:shd w:val="clear" w:color="auto" w:fill="FFFFFF"/>
-        </w:rPr>
-      </w:pPr>
-    </w:p>
-    <w:p>
-      <w:pPr>
-        <w:rPr>
-          <w:rFonts w:asciiTheme="majorHAnsi" w:hAnsiTheme="majorHAnsi" w:cs="Arial"/>
-          <w:b/>
-          <w:bCs/>
-          <w:color w:val="222222"/>
-          <w:shd w:val="clear" w:color="auto" w:fill="FFFFFF"/>
-        </w:rPr>
-      </w:pPr>
-      <w:r>
-        <w:rPr>
-          <w:rFonts w:asciiTheme="majorHAnsi" w:hAnsiTheme="majorHAnsi" w:cs="Arial"/>
-          <w:b/>
-          <w:bCs/>
-          <w:color w:val="222222"/>
-          <w:shd w:val="clear" w:color="auto" w:fill="FFFFFF"/>
-        </w:rPr>
-        <w:t>Line 331, re: “(ex. Supp. Figure 1</w:t>
+      </w:pPr>
+      <w:r>
+        <w:rPr>
+          <w:rFonts w:asciiTheme="majorHAnsi" w:hAnsiTheme="majorHAnsi" w:cs="Times New Roman"/>
+        </w:rPr>
+        <w:t>Corrected to use the same format: “91% to 79%”</w:t>
+      </w:r>
+    </w:p>
+    <w:p>
+      <w:pPr>
+        <w:rPr>
+          <w:rFonts w:asciiTheme="majorHAnsi" w:hAnsiTheme="majorHAnsi" w:cs="Arial"/>
+          <w:b/>
+          <w:bCs/>
+          <w:color w:val="222222"/>
+          <w:shd w:val="clear" w:color="auto" w:fill="FFFFFF"/>
+        </w:rPr>
+      </w:pPr>
+    </w:p>
+    <w:p>
+      <w:pPr>
+        <w:rPr>
+          <w:rFonts w:asciiTheme="majorHAnsi" w:hAnsiTheme="majorHAnsi" w:cs="Arial"/>
+          <w:b/>
+          <w:bCs/>
+          <w:color w:val="222222"/>
+          <w:shd w:val="clear" w:color="auto" w:fill="FFFFFF"/>
+        </w:rPr>
+      </w:pPr>
+      <w:r>
+        <w:rPr>
+          <w:rFonts w:asciiTheme="majorHAnsi" w:hAnsiTheme="majorHAnsi" w:cs="Arial"/>
+          <w:b/>
+          <w:bCs/>
+          <w:color w:val="222222"/>
+          <w:shd w:val="clear" w:color="auto" w:fill="FFFFFF"/>
+        </w:rPr>
+        <w:t xml:space="preserve">Lines 406-407, re: “provide probabilistic estimates of provenance and calibrated may be immediately </w:t>
+      </w:r>
+      <w:proofErr w:type="gramStart"/>
+      <w:r>
+        <w:rPr>
+          <w:rFonts w:asciiTheme="majorHAnsi" w:hAnsiTheme="majorHAnsi" w:cs="Arial"/>
+          <w:b/>
+          <w:bCs/>
+          <w:color w:val="222222"/>
+          <w:shd w:val="clear" w:color="auto" w:fill="FFFFFF"/>
+        </w:rPr>
+        <w:t>useful”  -</w:t>
+      </w:r>
+      <w:proofErr w:type="gramEnd"/>
+      <w:r>
+        <w:rPr>
+          <w:rFonts w:asciiTheme="majorHAnsi" w:hAnsiTheme="majorHAnsi" w:cs="Arial"/>
+          <w:b/>
+          <w:bCs/>
+          <w:color w:val="222222"/>
+          <w:shd w:val="clear" w:color="auto" w:fill="FFFFFF"/>
+        </w:rPr>
+        <w:t xml:space="preserve">  Is this missing a word, perhaps?  For example, “when calibrated” … </w:t>
+      </w:r>
+      <w:proofErr w:type="gramStart"/>
+      <w:r>
+        <w:rPr>
+          <w:rFonts w:asciiTheme="majorHAnsi" w:hAnsiTheme="majorHAnsi" w:cs="Arial"/>
+          <w:b/>
+          <w:bCs/>
+          <w:color w:val="222222"/>
+          <w:shd w:val="clear" w:color="auto" w:fill="FFFFFF"/>
+        </w:rPr>
+        <w:t>or,</w:t>
+      </w:r>
+      <w:proofErr w:type="gramEnd"/>
+      <w:r>
+        <w:rPr>
+          <w:rFonts w:asciiTheme="majorHAnsi" w:hAnsiTheme="majorHAnsi" w:cs="Arial"/>
+          <w:b/>
+          <w:bCs/>
+          <w:color w:val="222222"/>
+          <w:shd w:val="clear" w:color="auto" w:fill="FFFFFF"/>
+        </w:rPr>
+        <w:t xml:space="preserve"> “once calibrated”?</w:t>
+      </w:r>
+    </w:p>
+    <w:p>
+      <w:pPr>
+        <w:rPr>
+          <w:rFonts w:asciiTheme="majorHAnsi" w:hAnsiTheme="majorHAnsi" w:cs="Arial"/>
+          <w:color w:val="222222"/>
+          <w:shd w:val="clear" w:color="auto" w:fill="FFFFFF"/>
+        </w:rPr>
+      </w:pPr>
+      <w:r>
+        <w:rPr>
+          <w:rFonts w:asciiTheme="majorHAnsi" w:hAnsiTheme="majorHAnsi" w:cs="Arial"/>
+          <w:color w:val="222222"/>
+          <w:shd w:val="clear" w:color="auto" w:fill="FFFFFF"/>
+        </w:rPr>
+        <w:t>Added missing words</w:t>
+      </w:r>
+      <w:r>
+        <w:rPr>
+          <w:rFonts w:asciiTheme="majorHAnsi" w:hAnsiTheme="majorHAnsi" w:cs="Arial"/>
+          <w:color w:val="222222"/>
+          <w:shd w:val="clear" w:color="auto" w:fill="FFFFFF"/>
+        </w:rPr>
+        <w:t xml:space="preserve"> to this sentence to </w:t>
+      </w:r>
+      <w:proofErr w:type="gramStart"/>
+      <w:r>
+        <w:rPr>
+          <w:rFonts w:asciiTheme="majorHAnsi" w:hAnsiTheme="majorHAnsi" w:cs="Arial"/>
+          <w:color w:val="222222"/>
+          <w:shd w:val="clear" w:color="auto" w:fill="FFFFFF"/>
+        </w:rPr>
+        <w:t xml:space="preserve">read </w:t>
+      </w:r>
+      <w:r>
+        <w:rPr>
+          <w:rFonts w:asciiTheme="majorHAnsi" w:hAnsiTheme="majorHAnsi" w:cs="Arial"/>
+          <w:color w:val="222222"/>
+          <w:shd w:val="clear" w:color="auto" w:fill="FFFFFF"/>
+        </w:rPr>
+        <w:t>:</w:t>
+      </w:r>
+      <w:proofErr w:type="gramEnd"/>
+      <w:r>
+        <w:rPr>
+          <w:rFonts w:asciiTheme="majorHAnsi" w:hAnsiTheme="majorHAnsi" w:cs="Arial"/>
+          <w:color w:val="222222"/>
+          <w:shd w:val="clear" w:color="auto" w:fill="FFFFFF"/>
+        </w:rPr>
+        <w:t xml:space="preserve"> </w:t>
+      </w:r>
+    </w:p>
+    <w:p>
+      <w:pPr>
+        <w:rPr>
+          <w:rFonts w:asciiTheme="majorHAnsi" w:hAnsiTheme="majorHAnsi"/>
+        </w:rPr>
+      </w:pPr>
+      <w:proofErr w:type="gramStart"/>
+      <w:r>
+        <w:rPr>
+          <w:rFonts w:asciiTheme="majorHAnsi" w:hAnsiTheme="majorHAnsi" w:cs="Arial"/>
+          <w:color w:val="222222"/>
+          <w:shd w:val="clear" w:color="auto" w:fill="FFFFFF"/>
+        </w:rPr>
+        <w:lastRenderedPageBreak/>
+        <w:t xml:space="preserve">“ </w:t>
+      </w:r>
+      <w:r>
+        <w:rPr>
+          <w:rFonts w:asciiTheme="majorHAnsi" w:hAnsiTheme="majorHAnsi"/>
+        </w:rPr>
+        <w:t>The</w:t>
+      </w:r>
+      <w:proofErr w:type="gramEnd"/>
+      <w:r>
+        <w:rPr>
+          <w:rFonts w:asciiTheme="majorHAnsi" w:hAnsiTheme="majorHAnsi"/>
+        </w:rPr>
+        <w:t xml:space="preserve"> workflow developed here illustrates an approach that can be used alongside otolith LA-ICPMS data to provide probabilistic estimates of provenance and a calibrated classification model that may be immediately useful for classifying adult Chinook salmon from western Alaska watersheds” </w:t>
+      </w:r>
+    </w:p>
+    <w:p>
+      <w:pPr>
+        <w:rPr>
+          <w:rFonts w:asciiTheme="majorHAnsi" w:hAnsiTheme="majorHAnsi" w:cs="Arial"/>
+          <w:b/>
+          <w:bCs/>
+          <w:color w:val="222222"/>
+          <w:shd w:val="clear" w:color="auto" w:fill="FFFFFF"/>
+        </w:rPr>
+      </w:pPr>
+    </w:p>
+    <w:p>
+      <w:pPr>
+        <w:rPr>
+          <w:rFonts w:asciiTheme="majorHAnsi" w:hAnsiTheme="majorHAnsi"/>
+        </w:rPr>
+      </w:pPr>
+      <w:r>
+        <w:rPr>
+          <w:rFonts w:asciiTheme="majorHAnsi" w:hAnsiTheme="majorHAnsi" w:cs="Arial"/>
+          <w:b/>
+          <w:bCs/>
+          <w:color w:val="222222"/>
+          <w:shd w:val="clear" w:color="auto" w:fill="FFFFFF"/>
+        </w:rPr>
+        <w:t>Line 429, re: “dynamic time warping (Arai et al., 2025 (in review</w:t>
       </w:r>
       <w:proofErr w:type="gramStart"/>
       <w:r>
@@ -1984,84 +2354,263 @@
           <w:color w:val="222222"/>
           <w:shd w:val="clear" w:color="auto" w:fill="FFFFFF"/>
         </w:rPr>
-        <w:t xml:space="preserve">  I believe that you mean Supplemental Figure 2, yes?</w:t>
-      </w:r>
-    </w:p>
-    <w:p>
-      <w:pPr>
-        <w:rPr>
-          <w:rFonts w:asciiTheme="majorHAnsi" w:hAnsiTheme="majorHAnsi" w:cs="Arial"/>
-          <w:color w:val="222222"/>
-          <w:shd w:val="clear" w:color="auto" w:fill="FFFFFF"/>
-        </w:rPr>
-      </w:pPr>
-      <w:r>
-        <w:rPr>
-          <w:rFonts w:asciiTheme="majorHAnsi" w:hAnsiTheme="majorHAnsi" w:cs="Arial"/>
-          <w:color w:val="222222"/>
-          <w:shd w:val="clear" w:color="auto" w:fill="FFFFFF"/>
-        </w:rPr>
-        <w:t xml:space="preserve">Yes. Corrected to reference Supp. Figure 2 </w:t>
-      </w:r>
-    </w:p>
-    <w:p>
-      <w:pPr>
-        <w:rPr>
-          <w:rFonts w:asciiTheme="majorHAnsi" w:hAnsiTheme="majorHAnsi" w:cs="Arial"/>
-          <w:b/>
-          <w:bCs/>
-          <w:color w:val="222222"/>
-          <w:shd w:val="clear" w:color="auto" w:fill="FFFFFF"/>
-        </w:rPr>
-      </w:pPr>
-    </w:p>
-    <w:p>
-      <w:pPr>
-        <w:rPr>
-          <w:rFonts w:asciiTheme="majorHAnsi" w:hAnsiTheme="majorHAnsi" w:cs="Arial"/>
-          <w:b/>
-          <w:bCs/>
-          <w:color w:val="222222"/>
-          <w:shd w:val="clear" w:color="auto" w:fill="FFFFFF"/>
-        </w:rPr>
-      </w:pPr>
-      <w:r>
-        <w:rPr>
-          <w:rFonts w:asciiTheme="majorHAnsi" w:hAnsiTheme="majorHAnsi" w:cs="Arial"/>
-          <w:b/>
-          <w:bCs/>
-          <w:color w:val="222222"/>
-          <w:shd w:val="clear" w:color="auto" w:fill="FFFFFF"/>
-        </w:rPr>
-        <w:t>Line 331, re: “(ex. Supp. Figure 1</w:t>
-      </w:r>
-      <w:proofErr w:type="gramStart"/>
-      <w:r>
-        <w:rPr>
-          <w:rFonts w:asciiTheme="majorHAnsi" w:hAnsiTheme="majorHAnsi" w:cs="Arial"/>
-          <w:b/>
-          <w:bCs/>
-          <w:color w:val="222222"/>
-          <w:shd w:val="clear" w:color="auto" w:fill="FFFFFF"/>
-        </w:rPr>
-        <w:t>)”  -</w:t>
-      </w:r>
-      <w:proofErr w:type="gramEnd"/>
-      <w:r>
-        <w:rPr>
-          <w:rFonts w:asciiTheme="majorHAnsi" w:hAnsiTheme="majorHAnsi" w:cs="Arial"/>
-          <w:b/>
-          <w:bCs/>
-          <w:color w:val="222222"/>
-          <w:shd w:val="clear" w:color="auto" w:fill="FFFFFF"/>
-        </w:rPr>
-        <w:t xml:space="preserve">  I find this figure quite helpful to understanding the procedure.  As in, I would lobby for it to simply become Figure 6 … if the Editors do not protest.</w:t>
-      </w:r>
-    </w:p>
-    <w:p>
-      <w:pPr>
-        <w:rPr>
-          <w:rFonts w:asciiTheme="majorHAnsi" w:hAnsiTheme="majorHAnsi" w:cs="Arial"/>
+        <w:t xml:space="preserve">  Given that Arai et al. may never be published, and that they are relying on an established mathematical method for time-series alignment, I would suggest adding a reference in addition to Arai that describes DTW, generally.</w:t>
+      </w:r>
+    </w:p>
+    <w:p>
+      <w:pPr>
+        <w:rPr>
+          <w:rFonts w:asciiTheme="majorHAnsi" w:hAnsiTheme="majorHAnsi" w:cs="Arial"/>
+          <w:color w:val="222222"/>
+        </w:rPr>
+      </w:pPr>
+      <w:r>
+        <w:rPr>
+          <w:rFonts w:asciiTheme="majorHAnsi" w:hAnsiTheme="majorHAnsi" w:cs="Arial"/>
+          <w:color w:val="222222"/>
+        </w:rPr>
+        <w:t xml:space="preserve">In the time since submission Arai et al., 2026 * has been published. I cited both the published article as well as another article discussing the application of dynamic time warping to </w:t>
+      </w:r>
+      <w:r>
+        <w:rPr>
+          <w:rFonts w:asciiTheme="majorHAnsi" w:hAnsiTheme="majorHAnsi" w:cs="Arial"/>
+          <w:color w:val="222222"/>
+        </w:rPr>
+        <w:t>otolith derived</w:t>
+      </w:r>
+      <w:r>
+        <w:rPr>
+          <w:rFonts w:asciiTheme="majorHAnsi" w:hAnsiTheme="majorHAnsi" w:cs="Arial"/>
+          <w:color w:val="222222"/>
+        </w:rPr>
+        <w:t xml:space="preserve"> data </w:t>
+      </w:r>
+    </w:p>
+    <w:p>
+      <w:pPr>
+        <w:rPr>
+          <w:rFonts w:asciiTheme="majorHAnsi" w:hAnsiTheme="majorHAnsi" w:cs="Arial"/>
+          <w:color w:val="222222"/>
+          <w:shd w:val="clear" w:color="auto" w:fill="FFFFFF"/>
+        </w:rPr>
+      </w:pPr>
+    </w:p>
+    <w:p>
+      <w:pPr>
+        <w:rPr>
+          <w:rFonts w:asciiTheme="majorHAnsi" w:hAnsiTheme="majorHAnsi" w:cs="Arial"/>
+          <w:b/>
+          <w:bCs/>
+          <w:color w:val="222222"/>
+          <w:shd w:val="clear" w:color="auto" w:fill="FFFFFF"/>
+        </w:rPr>
+      </w:pPr>
+      <w:r>
+        <w:rPr>
+          <w:rFonts w:asciiTheme="majorHAnsi" w:hAnsiTheme="majorHAnsi" w:cs="Arial"/>
+          <w:b/>
+          <w:bCs/>
+          <w:color w:val="222222"/>
+          <w:shd w:val="clear" w:color="auto" w:fill="FFFFFF"/>
+        </w:rPr>
+        <w:t xml:space="preserve">Line 444, re: “given the increasingly endangered status of Chinook salmon in the </w:t>
+      </w:r>
+      <w:proofErr w:type="gramStart"/>
+      <w:r>
+        <w:rPr>
+          <w:rFonts w:asciiTheme="majorHAnsi" w:hAnsiTheme="majorHAnsi" w:cs="Arial"/>
+          <w:b/>
+          <w:bCs/>
+          <w:color w:val="222222"/>
+          <w:shd w:val="clear" w:color="auto" w:fill="FFFFFF"/>
+        </w:rPr>
+        <w:t>region”  -</w:t>
+      </w:r>
+      <w:proofErr w:type="gramEnd"/>
+      <w:r>
+        <w:rPr>
+          <w:rFonts w:asciiTheme="majorHAnsi" w:hAnsiTheme="majorHAnsi" w:cs="Arial"/>
+          <w:b/>
+          <w:bCs/>
+          <w:color w:val="222222"/>
+          <w:shd w:val="clear" w:color="auto" w:fill="FFFFFF"/>
+        </w:rPr>
+        <w:t xml:space="preserve">  Reference(s) to support that status designation?</w:t>
+      </w:r>
+    </w:p>
+    <w:p>
+      <w:pPr>
+        <w:rPr>
+          <w:rFonts w:asciiTheme="majorHAnsi" w:hAnsiTheme="majorHAnsi" w:cs="Arial"/>
+          <w:color w:val="222222"/>
+          <w:shd w:val="clear" w:color="auto" w:fill="FFFFFF"/>
+        </w:rPr>
+      </w:pPr>
+      <w:r>
+        <w:rPr>
+          <w:rFonts w:asciiTheme="majorHAnsi" w:hAnsiTheme="majorHAnsi" w:cs="Arial"/>
+          <w:color w:val="222222"/>
+          <w:shd w:val="clear" w:color="auto" w:fill="FFFFFF"/>
+        </w:rPr>
+        <w:t xml:space="preserve">Added multiple citations in reference to the </w:t>
+      </w:r>
+      <w:proofErr w:type="spellStart"/>
+      <w:r>
+        <w:rPr>
+          <w:rFonts w:asciiTheme="majorHAnsi" w:hAnsiTheme="majorHAnsi" w:cs="Arial"/>
+          <w:color w:val="222222"/>
+          <w:shd w:val="clear" w:color="auto" w:fill="FFFFFF"/>
+        </w:rPr>
+        <w:t>direc</w:t>
+      </w:r>
+      <w:proofErr w:type="spellEnd"/>
+      <w:r>
+        <w:rPr>
+          <w:rFonts w:asciiTheme="majorHAnsi" w:hAnsiTheme="majorHAnsi" w:cs="Arial"/>
+          <w:color w:val="222222"/>
+          <w:shd w:val="clear" w:color="auto" w:fill="FFFFFF"/>
+        </w:rPr>
+        <w:t xml:space="preserve"> conservation status of Chinook salmon in Western Alaska: Feddern et al., 2023, </w:t>
+      </w:r>
+      <w:proofErr w:type="spellStart"/>
+      <w:r>
+        <w:rPr>
+          <w:rFonts w:asciiTheme="majorHAnsi" w:hAnsiTheme="majorHAnsi" w:cs="Arial"/>
+          <w:color w:val="222222"/>
+          <w:shd w:val="clear" w:color="auto" w:fill="FFFFFF"/>
+        </w:rPr>
+        <w:t>Ohlberger</w:t>
+      </w:r>
+      <w:proofErr w:type="spellEnd"/>
+      <w:r>
+        <w:rPr>
+          <w:rFonts w:asciiTheme="majorHAnsi" w:hAnsiTheme="majorHAnsi" w:cs="Arial"/>
+          <w:color w:val="222222"/>
+          <w:shd w:val="clear" w:color="auto" w:fill="FFFFFF"/>
+        </w:rPr>
+        <w:t xml:space="preserve"> et al., 2018, Schindler at al., 2013. </w:t>
+      </w:r>
+    </w:p>
+    <w:p>
+      <w:pPr>
+        <w:rPr>
+          <w:rFonts w:asciiTheme="majorHAnsi" w:hAnsiTheme="majorHAnsi" w:cs="Arial"/>
+          <w:color w:val="222222"/>
+          <w:shd w:val="clear" w:color="auto" w:fill="FFFFFF"/>
+        </w:rPr>
+      </w:pPr>
+    </w:p>
+    <w:p>
+      <w:pPr>
+        <w:rPr>
+          <w:rFonts w:asciiTheme="majorHAnsi" w:hAnsiTheme="majorHAnsi" w:cs="Arial"/>
+          <w:color w:val="222222"/>
+          <w:shd w:val="clear" w:color="auto" w:fill="FFFFFF"/>
+        </w:rPr>
+      </w:pPr>
+    </w:p>
+    <w:p>
+      <w:pPr>
+        <w:rPr>
+          <w:rFonts w:asciiTheme="majorHAnsi" w:hAnsiTheme="majorHAnsi" w:cs="Arial"/>
+          <w:b/>
+          <w:bCs/>
+          <w:color w:val="222222"/>
+          <w:shd w:val="clear" w:color="auto" w:fill="FFFFFF"/>
+        </w:rPr>
+      </w:pPr>
+      <w:r>
+        <w:rPr>
+          <w:rFonts w:asciiTheme="majorHAnsi" w:hAnsiTheme="majorHAnsi" w:cs="Arial"/>
+          <w:b/>
+          <w:bCs/>
+          <w:color w:val="222222"/>
+          <w:shd w:val="clear" w:color="auto" w:fill="FFFFFF"/>
+        </w:rPr>
+        <w:t xml:space="preserve">Discussion, generally:  I like the Discussion, </w:t>
+      </w:r>
+      <w:proofErr w:type="gramStart"/>
+      <w:r>
+        <w:rPr>
+          <w:rFonts w:asciiTheme="majorHAnsi" w:hAnsiTheme="majorHAnsi" w:cs="Arial"/>
+          <w:b/>
+          <w:bCs/>
+          <w:color w:val="222222"/>
+          <w:shd w:val="clear" w:color="auto" w:fill="FFFFFF"/>
+        </w:rPr>
+        <w:t>as a general rule</w:t>
+      </w:r>
+      <w:proofErr w:type="gramEnd"/>
+      <w:r>
+        <w:rPr>
+          <w:rFonts w:asciiTheme="majorHAnsi" w:hAnsiTheme="majorHAnsi" w:cs="Arial"/>
+          <w:b/>
+          <w:bCs/>
+          <w:color w:val="222222"/>
+          <w:shd w:val="clear" w:color="auto" w:fill="FFFFFF"/>
+        </w:rPr>
+        <w:t xml:space="preserve">.  However, I think that you could be a little </w:t>
+      </w:r>
+      <w:proofErr w:type="gramStart"/>
+      <w:r>
+        <w:rPr>
+          <w:rFonts w:asciiTheme="majorHAnsi" w:hAnsiTheme="majorHAnsi" w:cs="Arial"/>
+          <w:b/>
+          <w:bCs/>
+          <w:color w:val="222222"/>
+          <w:shd w:val="clear" w:color="auto" w:fill="FFFFFF"/>
+        </w:rPr>
+        <w:t>more “blunt”</w:t>
+      </w:r>
+      <w:proofErr w:type="gramEnd"/>
+      <w:r>
+        <w:rPr>
+          <w:rFonts w:asciiTheme="majorHAnsi" w:hAnsiTheme="majorHAnsi" w:cs="Arial"/>
+          <w:b/>
+          <w:bCs/>
+          <w:color w:val="222222"/>
+          <w:shd w:val="clear" w:color="auto" w:fill="FFFFFF"/>
+        </w:rPr>
+        <w:t xml:space="preserve"> in pointing out what struck me while reading the results: my first impression, looking at Figure 2 (and Supplemental 1) was that “this will be hopeless”.  That is, from the PCA ordinations (which I have relied upon in my own elemental work), my first impression was “There’s no way we’ll ever be able to assign Kuskokwim fish with any accuracy, because the model can just drop them into the Yukon group and be done with it.”  And yet, attention to shape means everything here.  I would recommend stating that contrast overtly right up front: </w:t>
+      </w:r>
+      <w:proofErr w:type="gramStart"/>
+      <w:r>
+        <w:rPr>
+          <w:rFonts w:asciiTheme="majorHAnsi" w:hAnsiTheme="majorHAnsi" w:cs="Arial"/>
+          <w:b/>
+          <w:bCs/>
+          <w:color w:val="222222"/>
+          <w:shd w:val="clear" w:color="auto" w:fill="FFFFFF"/>
+        </w:rPr>
+        <w:t>this methods</w:t>
+      </w:r>
+      <w:proofErr w:type="gramEnd"/>
+      <w:r>
+        <w:rPr>
+          <w:rFonts w:asciiTheme="majorHAnsi" w:hAnsiTheme="majorHAnsi" w:cs="Arial"/>
+          <w:b/>
+          <w:bCs/>
+          <w:color w:val="222222"/>
+          <w:shd w:val="clear" w:color="auto" w:fill="FFFFFF"/>
+        </w:rPr>
+        <w:t xml:space="preserve"> does quite a nice job of discriminating origin in a species and system in which bulk analyses, or any technique that fails to account for the progression of elemental incorporation, would otherwise appear to be largely ineffective.  Ultimately, I think that this is the lesson that will make other people think about their own (failed) analyses: “Can I examine time-course of incorporation to ask get answers that have eluded us in the past?”</w:t>
+      </w:r>
+    </w:p>
+    <w:p>
+      <w:pPr>
+        <w:rPr>
+          <w:rFonts w:asciiTheme="majorHAnsi" w:hAnsiTheme="majorHAnsi" w:cs="Arial"/>
+          <w:color w:val="222222"/>
+          <w:shd w:val="clear" w:color="auto" w:fill="FFFFFF"/>
+        </w:rPr>
+      </w:pPr>
+    </w:p>
+    <w:p>
+      <w:pPr>
+        <w:rPr>
+          <w:rFonts w:asciiTheme="majorHAnsi" w:hAnsiTheme="majorHAnsi" w:cs="Arial"/>
+          <w:b/>
+          <w:bCs/>
           <w:color w:val="EE0000"/>
           <w:shd w:val="clear" w:color="auto" w:fill="FFFFFF"/>
         </w:rPr>
@@ -2069,559 +2618,12 @@
       <w:r>
         <w:rPr>
           <w:rFonts w:asciiTheme="majorHAnsi" w:hAnsiTheme="majorHAnsi" w:cs="Arial"/>
+          <w:b/>
+          <w:bCs/>
           <w:color w:val="EE0000"/>
           <w:shd w:val="clear" w:color="auto" w:fill="FFFFFF"/>
         </w:rPr>
-        <w:t xml:space="preserve">Check the number of allowed </w:t>
-      </w:r>
-      <w:proofErr w:type="gramStart"/>
-      <w:r>
-        <w:rPr>
-          <w:rFonts w:asciiTheme="majorHAnsi" w:hAnsiTheme="majorHAnsi" w:cs="Arial"/>
-          <w:color w:val="EE0000"/>
-          <w:shd w:val="clear" w:color="auto" w:fill="FFFFFF"/>
-        </w:rPr>
-        <w:t>figures ,</w:t>
-      </w:r>
-      <w:proofErr w:type="gramEnd"/>
-      <w:r>
-        <w:rPr>
-          <w:rFonts w:asciiTheme="majorHAnsi" w:hAnsiTheme="majorHAnsi" w:cs="Arial"/>
-          <w:color w:val="EE0000"/>
-          <w:shd w:val="clear" w:color="auto" w:fill="FFFFFF"/>
-        </w:rPr>
-        <w:t xml:space="preserve"> decide whether to keep </w:t>
-      </w:r>
-    </w:p>
-    <w:p>
-      <w:pPr>
-        <w:rPr>
-          <w:rFonts w:asciiTheme="majorHAnsi" w:hAnsiTheme="majorHAnsi" w:cs="Arial"/>
-          <w:b/>
-          <w:bCs/>
-          <w:color w:val="222222"/>
-          <w:shd w:val="clear" w:color="auto" w:fill="FFFFFF"/>
-        </w:rPr>
-      </w:pPr>
-    </w:p>
-    <w:p>
-      <w:pPr>
-        <w:rPr>
-          <w:rFonts w:asciiTheme="majorHAnsi" w:hAnsiTheme="majorHAnsi" w:cs="Arial"/>
-          <w:b/>
-          <w:bCs/>
-          <w:color w:val="222222"/>
-          <w:shd w:val="clear" w:color="auto" w:fill="FFFFFF"/>
-        </w:rPr>
-      </w:pPr>
-      <w:r>
-        <w:rPr>
-          <w:rFonts w:asciiTheme="majorHAnsi" w:hAnsiTheme="majorHAnsi" w:cs="Arial"/>
-          <w:b/>
-          <w:bCs/>
-          <w:color w:val="222222"/>
-          <w:shd w:val="clear" w:color="auto" w:fill="FFFFFF"/>
-        </w:rPr>
-        <w:t>Lines 333-334, re: “from 91 – 79% … and from 89.5% to 78</w:t>
-      </w:r>
-      <w:proofErr w:type="gramStart"/>
-      <w:r>
-        <w:rPr>
-          <w:rFonts w:asciiTheme="majorHAnsi" w:hAnsiTheme="majorHAnsi" w:cs="Arial"/>
-          <w:b/>
-          <w:bCs/>
-          <w:color w:val="222222"/>
-          <w:shd w:val="clear" w:color="auto" w:fill="FFFFFF"/>
-        </w:rPr>
-        <w:t>%”  -</w:t>
-      </w:r>
-      <w:proofErr w:type="gramEnd"/>
-      <w:r>
-        <w:rPr>
-          <w:rFonts w:asciiTheme="majorHAnsi" w:hAnsiTheme="majorHAnsi" w:cs="Arial"/>
-          <w:b/>
-          <w:bCs/>
-          <w:color w:val="222222"/>
-          <w:shd w:val="clear" w:color="auto" w:fill="FFFFFF"/>
-        </w:rPr>
-        <w:t xml:space="preserve">  Why two different formats within the same sentence, to indicate “to”?</w:t>
-      </w:r>
-    </w:p>
-    <w:p>
-      <w:pPr>
-        <w:rPr>
-          <w:rFonts w:asciiTheme="majorHAnsi" w:hAnsiTheme="majorHAnsi" w:cs="Times New Roman"/>
-        </w:rPr>
-      </w:pPr>
-      <w:r>
-        <w:rPr>
-          <w:rFonts w:asciiTheme="majorHAnsi" w:hAnsiTheme="majorHAnsi" w:cs="Times New Roman"/>
-        </w:rPr>
-        <w:t>Corrected to use the same format: “91% to 79%”</w:t>
-      </w:r>
-    </w:p>
-    <w:p>
-      <w:pPr>
-        <w:rPr>
-          <w:rFonts w:asciiTheme="majorHAnsi" w:hAnsiTheme="majorHAnsi" w:cs="Arial"/>
-          <w:b/>
-          <w:bCs/>
-          <w:color w:val="222222"/>
-          <w:shd w:val="clear" w:color="auto" w:fill="FFFFFF"/>
-        </w:rPr>
-      </w:pPr>
-    </w:p>
-    <w:p>
-      <w:pPr>
-        <w:rPr>
-          <w:rFonts w:asciiTheme="majorHAnsi" w:hAnsiTheme="majorHAnsi" w:cs="Arial"/>
-          <w:b/>
-          <w:bCs/>
-          <w:color w:val="222222"/>
-          <w:shd w:val="clear" w:color="auto" w:fill="FFFFFF"/>
-        </w:rPr>
-      </w:pPr>
-      <w:r>
-        <w:rPr>
-          <w:rFonts w:asciiTheme="majorHAnsi" w:hAnsiTheme="majorHAnsi" w:cs="Arial"/>
-          <w:b/>
-          <w:bCs/>
-          <w:color w:val="222222"/>
-          <w:shd w:val="clear" w:color="auto" w:fill="FFFFFF"/>
-        </w:rPr>
-        <w:t xml:space="preserve">Lines 406-407, re: “provide probabilistic estimates of provenance and calibrated may be immediately </w:t>
-      </w:r>
-      <w:proofErr w:type="gramStart"/>
-      <w:r>
-        <w:rPr>
-          <w:rFonts w:asciiTheme="majorHAnsi" w:hAnsiTheme="majorHAnsi" w:cs="Arial"/>
-          <w:b/>
-          <w:bCs/>
-          <w:color w:val="222222"/>
-          <w:shd w:val="clear" w:color="auto" w:fill="FFFFFF"/>
-        </w:rPr>
-        <w:t>useful”  -</w:t>
-      </w:r>
-      <w:proofErr w:type="gramEnd"/>
-      <w:r>
-        <w:rPr>
-          <w:rFonts w:asciiTheme="majorHAnsi" w:hAnsiTheme="majorHAnsi" w:cs="Arial"/>
-          <w:b/>
-          <w:bCs/>
-          <w:color w:val="222222"/>
-          <w:shd w:val="clear" w:color="auto" w:fill="FFFFFF"/>
-        </w:rPr>
-        <w:t xml:space="preserve">  Is this missing a word, perhaps?  For example, “when calibrated” … </w:t>
-      </w:r>
-      <w:proofErr w:type="gramStart"/>
-      <w:r>
-        <w:rPr>
-          <w:rFonts w:asciiTheme="majorHAnsi" w:hAnsiTheme="majorHAnsi" w:cs="Arial"/>
-          <w:b/>
-          <w:bCs/>
-          <w:color w:val="222222"/>
-          <w:shd w:val="clear" w:color="auto" w:fill="FFFFFF"/>
-        </w:rPr>
-        <w:t>or,</w:t>
-      </w:r>
-      <w:proofErr w:type="gramEnd"/>
-      <w:r>
-        <w:rPr>
-          <w:rFonts w:asciiTheme="majorHAnsi" w:hAnsiTheme="majorHAnsi" w:cs="Arial"/>
-          <w:b/>
-          <w:bCs/>
-          <w:color w:val="222222"/>
-          <w:shd w:val="clear" w:color="auto" w:fill="FFFFFF"/>
-        </w:rPr>
-        <w:t xml:space="preserve"> “once calibrated”?</w:t>
-      </w:r>
-    </w:p>
-    <w:p>
-      <w:pPr>
-        <w:rPr>
-          <w:rFonts w:asciiTheme="majorHAnsi" w:hAnsiTheme="majorHAnsi" w:cs="Arial"/>
-          <w:color w:val="222222"/>
-          <w:shd w:val="clear" w:color="auto" w:fill="FFFFFF"/>
-        </w:rPr>
-      </w:pPr>
-      <w:r>
-        <w:rPr>
-          <w:rFonts w:asciiTheme="majorHAnsi" w:hAnsiTheme="majorHAnsi" w:cs="Arial"/>
-          <w:color w:val="222222"/>
-          <w:shd w:val="clear" w:color="auto" w:fill="FFFFFF"/>
-        </w:rPr>
-        <w:t>Added missing words</w:t>
-      </w:r>
-      <w:r>
-        <w:rPr>
-          <w:rFonts w:asciiTheme="majorHAnsi" w:hAnsiTheme="majorHAnsi" w:cs="Arial"/>
-          <w:color w:val="222222"/>
-          <w:shd w:val="clear" w:color="auto" w:fill="FFFFFF"/>
-        </w:rPr>
-        <w:t xml:space="preserve"> to this sentence to </w:t>
-      </w:r>
-      <w:proofErr w:type="gramStart"/>
-      <w:r>
-        <w:rPr>
-          <w:rFonts w:asciiTheme="majorHAnsi" w:hAnsiTheme="majorHAnsi" w:cs="Arial"/>
-          <w:color w:val="222222"/>
-          <w:shd w:val="clear" w:color="auto" w:fill="FFFFFF"/>
-        </w:rPr>
-        <w:t xml:space="preserve">read </w:t>
-      </w:r>
-      <w:r>
-        <w:rPr>
-          <w:rFonts w:asciiTheme="majorHAnsi" w:hAnsiTheme="majorHAnsi" w:cs="Arial"/>
-          <w:color w:val="222222"/>
-          <w:shd w:val="clear" w:color="auto" w:fill="FFFFFF"/>
-        </w:rPr>
-        <w:t>:</w:t>
-      </w:r>
-      <w:proofErr w:type="gramEnd"/>
-      <w:r>
-        <w:rPr>
-          <w:rFonts w:asciiTheme="majorHAnsi" w:hAnsiTheme="majorHAnsi" w:cs="Arial"/>
-          <w:color w:val="222222"/>
-          <w:shd w:val="clear" w:color="auto" w:fill="FFFFFF"/>
-        </w:rPr>
-        <w:t xml:space="preserve"> </w:t>
-      </w:r>
-    </w:p>
-    <w:p>
-      <w:pPr>
-        <w:rPr>
-          <w:rFonts w:asciiTheme="majorHAnsi" w:hAnsiTheme="majorHAnsi"/>
-        </w:rPr>
-      </w:pPr>
-      <w:proofErr w:type="gramStart"/>
-      <w:r>
-        <w:rPr>
-          <w:rFonts w:asciiTheme="majorHAnsi" w:hAnsiTheme="majorHAnsi" w:cs="Arial"/>
-          <w:color w:val="222222"/>
-          <w:shd w:val="clear" w:color="auto" w:fill="FFFFFF"/>
-        </w:rPr>
-        <w:t xml:space="preserve">“ </w:t>
-      </w:r>
-      <w:r>
-        <w:rPr>
-          <w:rFonts w:asciiTheme="majorHAnsi" w:hAnsiTheme="majorHAnsi"/>
-        </w:rPr>
-        <w:t>The</w:t>
-      </w:r>
-      <w:proofErr w:type="gramEnd"/>
-      <w:r>
-        <w:rPr>
-          <w:rFonts w:asciiTheme="majorHAnsi" w:hAnsiTheme="majorHAnsi"/>
-        </w:rPr>
-        <w:t xml:space="preserve"> workflow developed here illustrates an approach that can be used alongside otolith LA-ICPMS data to provide probabilistic estimates of provenance and a calibrated classification model that may be immediately useful for classifying adult Chinook salmon from western Alaska watersheds” </w:t>
-      </w:r>
-    </w:p>
-    <w:p>
-      <w:pPr>
-        <w:rPr>
-          <w:rFonts w:asciiTheme="majorHAnsi" w:hAnsiTheme="majorHAnsi"/>
-        </w:rPr>
-      </w:pPr>
-      <w:r>
-        <w:rPr>
-          <w:rFonts w:asciiTheme="majorHAnsi" w:hAnsiTheme="majorHAnsi" w:cs="Arial"/>
-          <w:b/>
-          <w:bCs/>
-          <w:color w:val="222222"/>
-          <w:shd w:val="clear" w:color="auto" w:fill="FFFFFF"/>
-        </w:rPr>
         <w:lastRenderedPageBreak/>
-        <w:t>Line 429, re: “dynamic time warping (Arai et al., 2025 (in review</w:t>
-      </w:r>
-      <w:proofErr w:type="gramStart"/>
-      <w:r>
-        <w:rPr>
-          <w:rFonts w:asciiTheme="majorHAnsi" w:hAnsiTheme="majorHAnsi" w:cs="Arial"/>
-          <w:b/>
-          <w:bCs/>
-          <w:color w:val="222222"/>
-          <w:shd w:val="clear" w:color="auto" w:fill="FFFFFF"/>
-        </w:rPr>
-        <w:t>)”  -</w:t>
-      </w:r>
-      <w:proofErr w:type="gramEnd"/>
-      <w:r>
-        <w:rPr>
-          <w:rFonts w:asciiTheme="majorHAnsi" w:hAnsiTheme="majorHAnsi" w:cs="Arial"/>
-          <w:b/>
-          <w:bCs/>
-          <w:color w:val="222222"/>
-          <w:shd w:val="clear" w:color="auto" w:fill="FFFFFF"/>
-        </w:rPr>
-        <w:t xml:space="preserve">  Given that Arai et al. may never be published, and that they are relying on an established mathematical method for time-series alignment, I would suggest adding a reference in addition to Arai that describes DTW, generally.</w:t>
-      </w:r>
-    </w:p>
-    <w:p>
-      <w:pPr>
-        <w:rPr>
-          <w:rFonts w:asciiTheme="majorHAnsi" w:hAnsiTheme="majorHAnsi" w:cs="Arial"/>
-          <w:color w:val="222222"/>
-        </w:rPr>
-      </w:pPr>
-      <w:r>
-        <w:rPr>
-          <w:rFonts w:asciiTheme="majorHAnsi" w:hAnsiTheme="majorHAnsi" w:cs="Arial"/>
-          <w:color w:val="222222"/>
-        </w:rPr>
-        <w:t xml:space="preserve">In the time since submission Arai et al., 2026 * has been published. I cited both the published article as well as another article discussing the application of dynamic time warping to </w:t>
-      </w:r>
-      <w:r>
-        <w:rPr>
-          <w:rFonts w:asciiTheme="majorHAnsi" w:hAnsiTheme="majorHAnsi" w:cs="Arial"/>
-          <w:color w:val="222222"/>
-        </w:rPr>
-        <w:t>otolith derived</w:t>
-      </w:r>
-      <w:r>
-        <w:rPr>
-          <w:rFonts w:asciiTheme="majorHAnsi" w:hAnsiTheme="majorHAnsi" w:cs="Arial"/>
-          <w:color w:val="222222"/>
-        </w:rPr>
-        <w:t xml:space="preserve"> data </w:t>
-      </w:r>
-    </w:p>
-    <w:p>
-      <w:pPr>
-        <w:rPr>
-          <w:rFonts w:asciiTheme="majorHAnsi" w:hAnsiTheme="majorHAnsi" w:cs="Arial"/>
-          <w:color w:val="222222"/>
-          <w:shd w:val="clear" w:color="auto" w:fill="FFFFFF"/>
-        </w:rPr>
-      </w:pPr>
-    </w:p>
-    <w:p>
-      <w:pPr>
-        <w:rPr>
-          <w:rFonts w:asciiTheme="majorHAnsi" w:hAnsiTheme="majorHAnsi" w:cs="Arial"/>
-          <w:b/>
-          <w:bCs/>
-          <w:color w:val="222222"/>
-          <w:shd w:val="clear" w:color="auto" w:fill="FFFFFF"/>
-        </w:rPr>
-      </w:pPr>
-      <w:r>
-        <w:rPr>
-          <w:rFonts w:asciiTheme="majorHAnsi" w:hAnsiTheme="majorHAnsi" w:cs="Arial"/>
-          <w:b/>
-          <w:bCs/>
-          <w:color w:val="222222"/>
-          <w:shd w:val="clear" w:color="auto" w:fill="FFFFFF"/>
-        </w:rPr>
-        <w:t xml:space="preserve">Line 444, re: “given the increasingly endangered status of Chinook salmon in the </w:t>
-      </w:r>
-      <w:proofErr w:type="gramStart"/>
-      <w:r>
-        <w:rPr>
-          <w:rFonts w:asciiTheme="majorHAnsi" w:hAnsiTheme="majorHAnsi" w:cs="Arial"/>
-          <w:b/>
-          <w:bCs/>
-          <w:color w:val="222222"/>
-          <w:shd w:val="clear" w:color="auto" w:fill="FFFFFF"/>
-        </w:rPr>
-        <w:t>region”  -</w:t>
-      </w:r>
-      <w:proofErr w:type="gramEnd"/>
-      <w:r>
-        <w:rPr>
-          <w:rFonts w:asciiTheme="majorHAnsi" w:hAnsiTheme="majorHAnsi" w:cs="Arial"/>
-          <w:b/>
-          <w:bCs/>
-          <w:color w:val="222222"/>
-          <w:shd w:val="clear" w:color="auto" w:fill="FFFFFF"/>
-        </w:rPr>
-        <w:t xml:space="preserve">  Reference(s) to support that status designation?</w:t>
-      </w:r>
-    </w:p>
-    <w:p>
-      <w:pPr>
-        <w:rPr>
-          <w:rFonts w:asciiTheme="majorHAnsi" w:hAnsiTheme="majorHAnsi" w:cs="Arial"/>
-          <w:color w:val="222222"/>
-          <w:shd w:val="clear" w:color="auto" w:fill="FFFFFF"/>
-        </w:rPr>
-      </w:pPr>
-      <w:r>
-        <w:rPr>
-          <w:rFonts w:asciiTheme="majorHAnsi" w:hAnsiTheme="majorHAnsi" w:cs="Arial"/>
-          <w:color w:val="222222"/>
-          <w:shd w:val="clear" w:color="auto" w:fill="FFFFFF"/>
-        </w:rPr>
-        <w:t xml:space="preserve">Added multiple citations in reference to the </w:t>
-      </w:r>
-      <w:proofErr w:type="spellStart"/>
-      <w:r>
-        <w:rPr>
-          <w:rFonts w:asciiTheme="majorHAnsi" w:hAnsiTheme="majorHAnsi" w:cs="Arial"/>
-          <w:color w:val="222222"/>
-          <w:shd w:val="clear" w:color="auto" w:fill="FFFFFF"/>
-        </w:rPr>
-        <w:t>direc</w:t>
-      </w:r>
-      <w:proofErr w:type="spellEnd"/>
-      <w:r>
-        <w:rPr>
-          <w:rFonts w:asciiTheme="majorHAnsi" w:hAnsiTheme="majorHAnsi" w:cs="Arial"/>
-          <w:color w:val="222222"/>
-          <w:shd w:val="clear" w:color="auto" w:fill="FFFFFF"/>
-        </w:rPr>
-        <w:t xml:space="preserve"> conservation status of Chinook salmon in Western Alaska: Feddern et al., 2023, </w:t>
-      </w:r>
-      <w:proofErr w:type="spellStart"/>
-      <w:r>
-        <w:rPr>
-          <w:rFonts w:asciiTheme="majorHAnsi" w:hAnsiTheme="majorHAnsi" w:cs="Arial"/>
-          <w:color w:val="222222"/>
-          <w:shd w:val="clear" w:color="auto" w:fill="FFFFFF"/>
-        </w:rPr>
-        <w:t>Ohlberger</w:t>
-      </w:r>
-      <w:proofErr w:type="spellEnd"/>
-      <w:r>
-        <w:rPr>
-          <w:rFonts w:asciiTheme="majorHAnsi" w:hAnsiTheme="majorHAnsi" w:cs="Arial"/>
-          <w:color w:val="222222"/>
-          <w:shd w:val="clear" w:color="auto" w:fill="FFFFFF"/>
-        </w:rPr>
-        <w:t xml:space="preserve"> et al., 2018, Schindler at al., 2013. </w:t>
-      </w:r>
-    </w:p>
-    <w:p>
-      <w:pPr>
-        <w:rPr>
-          <w:rFonts w:asciiTheme="majorHAnsi" w:hAnsiTheme="majorHAnsi" w:cs="Arial"/>
-          <w:color w:val="222222"/>
-          <w:shd w:val="clear" w:color="auto" w:fill="FFFFFF"/>
-        </w:rPr>
-      </w:pPr>
-    </w:p>
-    <w:p>
-      <w:pPr>
-        <w:rPr>
-          <w:rFonts w:asciiTheme="majorHAnsi" w:hAnsiTheme="majorHAnsi" w:cs="Arial"/>
-          <w:color w:val="222222"/>
-          <w:shd w:val="clear" w:color="auto" w:fill="FFFFFF"/>
-        </w:rPr>
-      </w:pPr>
-    </w:p>
-    <w:p>
-      <w:pPr>
-        <w:rPr>
-          <w:rFonts w:asciiTheme="majorHAnsi" w:hAnsiTheme="majorHAnsi" w:cs="Arial"/>
-          <w:b/>
-          <w:bCs/>
-          <w:color w:val="222222"/>
-          <w:shd w:val="clear" w:color="auto" w:fill="FFFFFF"/>
-        </w:rPr>
-      </w:pPr>
-      <w:r>
-        <w:rPr>
-          <w:rFonts w:asciiTheme="majorHAnsi" w:hAnsiTheme="majorHAnsi" w:cs="Arial"/>
-          <w:b/>
-          <w:bCs/>
-          <w:color w:val="222222"/>
-          <w:shd w:val="clear" w:color="auto" w:fill="FFFFFF"/>
-        </w:rPr>
-        <w:t xml:space="preserve">Discussion, generally:  I like the Discussion, </w:t>
-      </w:r>
-      <w:proofErr w:type="gramStart"/>
-      <w:r>
-        <w:rPr>
-          <w:rFonts w:asciiTheme="majorHAnsi" w:hAnsiTheme="majorHAnsi" w:cs="Arial"/>
-          <w:b/>
-          <w:bCs/>
-          <w:color w:val="222222"/>
-          <w:shd w:val="clear" w:color="auto" w:fill="FFFFFF"/>
-        </w:rPr>
-        <w:t>as a general rule</w:t>
-      </w:r>
-      <w:proofErr w:type="gramEnd"/>
-      <w:r>
-        <w:rPr>
-          <w:rFonts w:asciiTheme="majorHAnsi" w:hAnsiTheme="majorHAnsi" w:cs="Arial"/>
-          <w:b/>
-          <w:bCs/>
-          <w:color w:val="222222"/>
-          <w:shd w:val="clear" w:color="auto" w:fill="FFFFFF"/>
-        </w:rPr>
-        <w:t xml:space="preserve">.  However, I think that you could be a little </w:t>
-      </w:r>
-      <w:proofErr w:type="gramStart"/>
-      <w:r>
-        <w:rPr>
-          <w:rFonts w:asciiTheme="majorHAnsi" w:hAnsiTheme="majorHAnsi" w:cs="Arial"/>
-          <w:b/>
-          <w:bCs/>
-          <w:color w:val="222222"/>
-          <w:shd w:val="clear" w:color="auto" w:fill="FFFFFF"/>
-        </w:rPr>
-        <w:t>more “blunt”</w:t>
-      </w:r>
-      <w:proofErr w:type="gramEnd"/>
-      <w:r>
-        <w:rPr>
-          <w:rFonts w:asciiTheme="majorHAnsi" w:hAnsiTheme="majorHAnsi" w:cs="Arial"/>
-          <w:b/>
-          <w:bCs/>
-          <w:color w:val="222222"/>
-          <w:shd w:val="clear" w:color="auto" w:fill="FFFFFF"/>
-        </w:rPr>
-        <w:t xml:space="preserve"> in pointing out what struck me while reading the results: my first impression, looking at Figure 2 (and Supplemental 1) was that “this will be hopeless”.  That is, from the PCA ordinations (which I have relied upon in my own elemental work), my first impression was “There’s no way we’ll ever be able to assign Kuskokwim fish with any accuracy, because the model can just drop them into the Yukon group and be done with it.”  And yet, attention to shape means everything here.  I would recommend stating that contrast overtly right up front: </w:t>
-      </w:r>
-      <w:proofErr w:type="gramStart"/>
-      <w:r>
-        <w:rPr>
-          <w:rFonts w:asciiTheme="majorHAnsi" w:hAnsiTheme="majorHAnsi" w:cs="Arial"/>
-          <w:b/>
-          <w:bCs/>
-          <w:color w:val="222222"/>
-          <w:shd w:val="clear" w:color="auto" w:fill="FFFFFF"/>
-        </w:rPr>
-        <w:t>this methods</w:t>
-      </w:r>
-      <w:proofErr w:type="gramEnd"/>
-      <w:r>
-        <w:rPr>
-          <w:rFonts w:asciiTheme="majorHAnsi" w:hAnsiTheme="majorHAnsi" w:cs="Arial"/>
-          <w:b/>
-          <w:bCs/>
-          <w:color w:val="222222"/>
-          <w:shd w:val="clear" w:color="auto" w:fill="FFFFFF"/>
-        </w:rPr>
-        <w:t xml:space="preserve"> does quite a nice job of discriminating origin in a species and system in which bulk analyses, or any technique that fails to account for the progression of elemental incorporation, would otherwise appear to be largely ineffective.  Ultimately, I think that this is the lesson that will make other people think about their own (failed) analyses: “Can I examine time-course of incorporation to ask get answers that have eluded us in the past?”</w:t>
-      </w:r>
-    </w:p>
-    <w:p>
-      <w:pPr>
-        <w:rPr>
-          <w:rFonts w:asciiTheme="majorHAnsi" w:hAnsiTheme="majorHAnsi" w:cs="Arial"/>
-          <w:color w:val="222222"/>
-          <w:shd w:val="clear" w:color="auto" w:fill="FFFFFF"/>
-        </w:rPr>
-      </w:pPr>
-    </w:p>
-    <w:p>
-      <w:pPr>
-        <w:rPr>
-          <w:rFonts w:asciiTheme="majorHAnsi" w:hAnsiTheme="majorHAnsi" w:cs="Arial"/>
-          <w:b/>
-          <w:bCs/>
-          <w:color w:val="EE0000"/>
-          <w:shd w:val="clear" w:color="auto" w:fill="FFFFFF"/>
-        </w:rPr>
-      </w:pPr>
-      <w:r>
-        <w:rPr>
-          <w:rFonts w:asciiTheme="majorHAnsi" w:hAnsiTheme="majorHAnsi" w:cs="Arial"/>
-          <w:b/>
-          <w:bCs/>
-          <w:color w:val="EE0000"/>
-          <w:shd w:val="clear" w:color="auto" w:fill="FFFFFF"/>
-        </w:rPr>
         <w:t xml:space="preserve">Add to discussion </w:t>
       </w:r>
     </w:p>
@@ -2644,6 +2646,50 @@
           <w:shd w:val="clear" w:color="auto" w:fill="FFFFFF"/>
         </w:rPr>
       </w:pPr>
+    </w:p>
+    <w:p>
+      <w:pPr>
+        <w:rPr>
+          <w:rFonts w:asciiTheme="majorHAnsi" w:hAnsiTheme="majorHAnsi" w:cs="Arial"/>
+          <w:b/>
+          <w:bCs/>
+          <w:color w:val="222222"/>
+          <w:shd w:val="clear" w:color="auto" w:fill="FFFFFF"/>
+        </w:rPr>
+      </w:pPr>
+    </w:p>
+    <w:p>
+      <w:pPr>
+        <w:rPr>
+          <w:rFonts w:asciiTheme="majorHAnsi" w:hAnsiTheme="majorHAnsi" w:cs="Arial"/>
+          <w:b/>
+          <w:bCs/>
+          <w:color w:val="222222"/>
+          <w:shd w:val="clear" w:color="auto" w:fill="FFFFFF"/>
+        </w:rPr>
+      </w:pPr>
+    </w:p>
+    <w:p>
+      <w:pPr>
+        <w:rPr>
+          <w:rFonts w:asciiTheme="majorHAnsi" w:hAnsiTheme="majorHAnsi" w:cs="Arial"/>
+          <w:b/>
+          <w:bCs/>
+          <w:color w:val="222222"/>
+          <w:shd w:val="clear" w:color="auto" w:fill="FFFFFF"/>
+        </w:rPr>
+      </w:pPr>
+    </w:p>
+    <w:p>
+      <w:pPr>
+        <w:rPr>
+          <w:rFonts w:asciiTheme="majorHAnsi" w:hAnsiTheme="majorHAnsi" w:cs="Arial"/>
+          <w:b/>
+          <w:bCs/>
+          <w:color w:val="222222"/>
+          <w:shd w:val="clear" w:color="auto" w:fill="FFFFFF"/>
+        </w:rPr>
+      </w:pPr>
       <w:r>
         <w:rPr>
           <w:rFonts w:asciiTheme="majorHAnsi" w:hAnsiTheme="majorHAnsi" w:cs="Arial"/>
@@ -2681,7 +2727,6 @@
           <w:color w:val="222222"/>
           <w:shd w:val="clear" w:color="auto" w:fill="FFFFFF"/>
         </w:rPr>
-        <w:lastRenderedPageBreak/>
         <w:t xml:space="preserve">The technician that assisted in mass spec etc. is not a co-author on this manuscript. Data were initially collected and analyzed for other projects for which these individuals are </w:t>
       </w:r>
       <w:r>
@@ -2747,21 +2792,24 @@
           <w:color w:val="222222"/>
           <w:shd w:val="clear" w:color="auto" w:fill="FFFFFF"/>
         </w:rPr>
-        <w:t>The University of Utah Strontium Metals lab have been longstanding partners in performing laser ablation and consulting on LA-ICPMS data, and we thank them for their continued support and contribution to producing this dataset. We also acknowledge the Keck lab at Oregon State University for their support and guidance.</w:t>
-      </w:r>
-      <w:r>
-        <w:rPr>
-          <w:rFonts w:ascii="Garamond" w:hAnsi="Garamond"/>
-          <w:color w:val="222222"/>
-          <w:shd w:val="clear" w:color="auto" w:fill="FFFFFF"/>
-        </w:rPr>
-        <w:t>”</w:t>
-      </w:r>
-    </w:p>
-    <w:p>
-      <w:pPr>
-        <w:rPr>
-          <w:rFonts w:asciiTheme="majorHAnsi" w:hAnsiTheme="majorHAnsi" w:cs="Arial"/>
+        <w:t>The University of Utah Strontium Metals lab have been longstanding partners in performing laser ablation and consulting on LA-ICPMS data, and we thank them for their continued support and contribution to producing this dataset. We also acknowledge the Keck lab at Oregon State University for their support and guidance.”</w:t>
+      </w:r>
+    </w:p>
+    <w:p>
+      <w:pPr>
+        <w:rPr>
+          <w:rFonts w:asciiTheme="majorHAnsi" w:hAnsiTheme="majorHAnsi" w:cs="Arial"/>
+          <w:color w:val="222222"/>
+          <w:shd w:val="clear" w:color="auto" w:fill="FFFFFF"/>
+        </w:rPr>
+      </w:pPr>
+    </w:p>
+    <w:p>
+      <w:pPr>
+        <w:rPr>
+          <w:rFonts w:asciiTheme="majorHAnsi" w:hAnsiTheme="majorHAnsi" w:cs="Arial"/>
+          <w:b/>
+          <w:bCs/>
           <w:color w:val="222222"/>
           <w:shd w:val="clear" w:color="auto" w:fill="FFFFFF"/>
         </w:rPr>
@@ -3128,7 +3176,16 @@
           <w:color w:val="222222"/>
           <w:shd w:val="clear" w:color="auto" w:fill="FFFFFF"/>
         </w:rPr>
-        <w:t xml:space="preserve"> chemical fingerprints in otoliths of western Alaska Chinook salmon to identify their river of origin, addressing an important limitation in management, associated with the inability of genetic stock identification to discriminate among river-specific populations. This integration of time-resolved otolith chemistry with pattern-recognition approaches represents a compelling advance. Overall, Machine learning tools applied to otolith laser ablation time series data proved highly effective. Moreover, the authors outline how raw ML confidence scores are often poorly calibrated, and by explicitly evaluating performance across confidence thresholds, the study moves beyond simple accuracy metrics and provides a practical framework for incorporating misclassification risk. This is a thoughtful and commendable addition that enhances the applied value of the work. Overall, the work is sound, easy to read, and of interest for fisheries management and ICES JMS readership. I only have a few comments and clarifications.</w:t>
+        <w:t xml:space="preserve"> chemical fingerprints in otoliths of western Alaska Chinook salmon to identify their river of origin, addressing an important limitation in management, associated with the inability of genetic stock identification to discriminate among river-specific populations. This integration of time-resolved otolith chemistry with pattern-recognition approaches represents a compelling advance. Overall, Machine learning tools applied to otolith laser ablation time series data proved highly effective. Moreover, the authors outline how raw ML confidence scores are often poorly calibrated, and by explicitly evaluating performance across confidence thresholds, the study moves beyond simple accuracy metrics and provides a practical framework for incorporating misclassification risk. This is a thoughtful and commendable addition that enhances the applied value of the work. Overall, the work is sound, easy to read, and of interest for fisheries management and ICES JMS readership. I only have a </w:t>
+      </w:r>
+      <w:r>
+        <w:rPr>
+          <w:rFonts w:ascii="Arial" w:hAnsi="Arial" w:cs="Arial"/>
+          <w:color w:val="222222"/>
+          <w:shd w:val="clear" w:color="auto" w:fill="FFFFFF"/>
+        </w:rPr>
+        <w:lastRenderedPageBreak/>
+        <w:t>few comments and clarifications.</w:t>
       </w:r>
       <w:r>
         <w:rPr>
@@ -3320,6 +3377,7 @@
           <w:rFonts w:ascii="Arial" w:hAnsi="Arial" w:cs="Arial"/>
           <w:color w:val="EE0000"/>
         </w:rPr>
+        <w:lastRenderedPageBreak/>
         <w:t xml:space="preserve">Add description after reading full discussion </w:t>
       </w:r>
       <w:r>
@@ -3347,6 +3405,28 @@
           <w:shd w:val="clear" w:color="auto" w:fill="FFFFFF"/>
         </w:rPr>
       </w:pPr>
+    </w:p>
+    <w:p>
+      <w:pPr>
+        <w:rPr>
+          <w:rFonts w:ascii="Arial" w:hAnsi="Arial" w:cs="Arial"/>
+          <w:b/>
+          <w:bCs/>
+          <w:color w:val="222222"/>
+          <w:shd w:val="clear" w:color="auto" w:fill="FFFFFF"/>
+        </w:rPr>
+      </w:pPr>
+    </w:p>
+    <w:p>
+      <w:pPr>
+        <w:rPr>
+          <w:rFonts w:ascii="Arial" w:hAnsi="Arial" w:cs="Arial"/>
+          <w:b/>
+          <w:bCs/>
+          <w:color w:val="222222"/>
+          <w:shd w:val="clear" w:color="auto" w:fill="FFFFFF"/>
+        </w:rPr>
+      </w:pPr>
       <w:r>
         <w:rPr>
           <w:rFonts w:ascii="Arial" w:hAnsi="Arial" w:cs="Arial"/>
@@ -3430,6 +3510,8 @@
       <w:pPr>
         <w:rPr>
           <w:rFonts w:ascii="Arial" w:hAnsi="Arial" w:cs="Arial"/>
+          <w:b/>
+          <w:bCs/>
           <w:color w:val="222222"/>
           <w:shd w:val="clear" w:color="auto" w:fill="FFFFFF"/>
         </w:rPr>
@@ -3454,249 +3536,268 @@
           <w:color w:val="222222"/>
           <w:shd w:val="clear" w:color="auto" w:fill="FFFFFF"/>
         </w:rPr>
+        <w:t>Minor edits</w:t>
+      </w:r>
+      <w:r>
+        <w:rPr>
+          <w:rFonts w:ascii="Arial" w:hAnsi="Arial" w:cs="Arial"/>
+          <w:color w:val="222222"/>
+        </w:rPr>
+        <w:br/>
+      </w:r>
+    </w:p>
+    <w:p>
+      <w:pPr>
+        <w:rPr>
+          <w:rFonts w:ascii="Arial" w:hAnsi="Arial" w:cs="Arial"/>
+          <w:color w:val="222222"/>
+          <w:shd w:val="clear" w:color="auto" w:fill="FFFFFF"/>
+        </w:rPr>
+      </w:pPr>
+      <w:r>
+        <w:rPr>
+          <w:rFonts w:ascii="Arial" w:hAnsi="Arial" w:cs="Arial"/>
+          <w:b/>
+          <w:bCs/>
+          <w:color w:val="222222"/>
+          <w:shd w:val="clear" w:color="auto" w:fill="FFFFFF"/>
+        </w:rPr>
+        <w:t xml:space="preserve">L. 133– I assume </w:t>
+      </w:r>
+      <w:proofErr w:type="gramStart"/>
+      <w:r>
+        <w:rPr>
+          <w:rFonts w:ascii="Arial" w:hAnsi="Arial" w:cs="Arial"/>
+          <w:b/>
+          <w:bCs/>
+          <w:color w:val="222222"/>
+          <w:shd w:val="clear" w:color="auto" w:fill="FFFFFF"/>
+        </w:rPr>
+        <w:t>Bristol bay</w:t>
+      </w:r>
+      <w:proofErr w:type="gramEnd"/>
+      <w:r>
+        <w:rPr>
+          <w:rFonts w:ascii="Arial" w:hAnsi="Arial" w:cs="Arial"/>
+          <w:b/>
+          <w:bCs/>
+          <w:color w:val="222222"/>
+          <w:shd w:val="clear" w:color="auto" w:fill="FFFFFF"/>
+        </w:rPr>
+        <w:t xml:space="preserve"> is directly in the vicinity of the Nushagak – but maybe some added clarification will be beneficial to interpret that all Chinook salmon caught in Bristol Bay were returning to the Nushagak River.</w:t>
+      </w:r>
+    </w:p>
+    <w:p>
+      <w:pPr>
+        <w:rPr>
+          <w:rFonts w:ascii="Arial" w:hAnsi="Arial" w:cs="Arial"/>
+          <w:color w:val="222222"/>
+          <w:shd w:val="clear" w:color="auto" w:fill="FFFFFF"/>
+        </w:rPr>
+      </w:pPr>
+    </w:p>
+    <w:p>
+      <w:pPr>
+        <w:rPr>
+          <w:rFonts w:ascii="Arial" w:hAnsi="Arial" w:cs="Arial"/>
+          <w:color w:val="222222"/>
+          <w:shd w:val="clear" w:color="auto" w:fill="FFFFFF"/>
+        </w:rPr>
+      </w:pPr>
+      <w:r>
+        <w:rPr>
+          <w:rFonts w:ascii="Arial" w:hAnsi="Arial" w:cs="Arial"/>
+          <w:color w:val="222222"/>
+          <w:shd w:val="clear" w:color="auto" w:fill="FFFFFF"/>
+        </w:rPr>
+        <w:t xml:space="preserve">We added clarification and management document reference that nearly all Chinook salmon Caught in </w:t>
+      </w:r>
+      <w:proofErr w:type="gramStart"/>
+      <w:r>
+        <w:rPr>
+          <w:rFonts w:ascii="Arial" w:hAnsi="Arial" w:cs="Arial"/>
+          <w:color w:val="222222"/>
+          <w:shd w:val="clear" w:color="auto" w:fill="FFFFFF"/>
+        </w:rPr>
+        <w:t>the this</w:t>
+      </w:r>
+      <w:proofErr w:type="gramEnd"/>
+      <w:r>
+        <w:rPr>
+          <w:rFonts w:ascii="Arial" w:hAnsi="Arial" w:cs="Arial"/>
+          <w:color w:val="222222"/>
+          <w:shd w:val="clear" w:color="auto" w:fill="FFFFFF"/>
+        </w:rPr>
+        <w:t xml:space="preserve"> region </w:t>
+      </w:r>
+      <w:proofErr w:type="gramStart"/>
+      <w:r>
+        <w:rPr>
+          <w:rFonts w:ascii="Arial" w:hAnsi="Arial" w:cs="Arial"/>
+          <w:color w:val="222222"/>
+          <w:shd w:val="clear" w:color="auto" w:fill="FFFFFF"/>
+        </w:rPr>
+        <w:t>are</w:t>
+      </w:r>
+      <w:proofErr w:type="gramEnd"/>
+      <w:r>
+        <w:rPr>
+          <w:rFonts w:ascii="Arial" w:hAnsi="Arial" w:cs="Arial"/>
+          <w:color w:val="222222"/>
+          <w:shd w:val="clear" w:color="auto" w:fill="FFFFFF"/>
+        </w:rPr>
+        <w:t xml:space="preserve"> Nushagak Origin Fish. </w:t>
+      </w:r>
+    </w:p>
+    <w:p>
+      <w:pPr>
+        <w:rPr>
+          <w:rFonts w:ascii="Arial" w:hAnsi="Arial" w:cs="Arial"/>
+          <w:color w:val="222222"/>
+          <w:shd w:val="clear" w:color="auto" w:fill="FFFFFF"/>
+        </w:rPr>
+      </w:pPr>
+    </w:p>
+    <w:p>
+      <w:pPr>
+        <w:rPr>
+          <w:rFonts w:ascii="Arial" w:hAnsi="Arial" w:cs="Arial"/>
+          <w:b/>
+          <w:bCs/>
+          <w:color w:val="222222"/>
+          <w:shd w:val="clear" w:color="auto" w:fill="FFFFFF"/>
+        </w:rPr>
+      </w:pPr>
+      <w:r>
+        <w:rPr>
+          <w:rFonts w:ascii="Arial" w:hAnsi="Arial" w:cs="Arial"/>
+          <w:color w:val="222222"/>
+        </w:rPr>
+        <w:br/>
+      </w:r>
+      <w:r>
+        <w:rPr>
+          <w:rFonts w:ascii="Arial" w:hAnsi="Arial" w:cs="Arial"/>
+          <w:b/>
+          <w:bCs/>
+          <w:color w:val="222222"/>
+          <w:shd w:val="clear" w:color="auto" w:fill="FFFFFF"/>
+        </w:rPr>
+        <w:t>Check end of Line 150 - … outlined in Makhlouf et al.,2025 (West &amp; Dann, 2019).</w:t>
+      </w:r>
+      <w:r>
+        <w:rPr>
+          <w:rFonts w:ascii="Arial" w:hAnsi="Arial" w:cs="Arial"/>
+          <w:b/>
+          <w:bCs/>
+          <w:color w:val="222222"/>
+        </w:rPr>
+        <w:br/>
+      </w:r>
+    </w:p>
+    <w:p>
+      <w:pPr>
+        <w:rPr>
+          <w:rFonts w:ascii="Arial" w:hAnsi="Arial" w:cs="Arial"/>
+          <w:color w:val="222222"/>
+          <w:shd w:val="clear" w:color="auto" w:fill="FFFFFF"/>
+        </w:rPr>
+      </w:pPr>
+      <w:r>
+        <w:rPr>
+          <w:rFonts w:ascii="Arial" w:hAnsi="Arial" w:cs="Arial"/>
+          <w:color w:val="222222"/>
+          <w:shd w:val="clear" w:color="auto" w:fill="FFFFFF"/>
+        </w:rPr>
+        <w:t xml:space="preserve">This is corrected to be Makhlouf et al., 2025, where the methods are referenced. </w:t>
+      </w:r>
+    </w:p>
+    <w:p>
+      <w:pPr>
+        <w:rPr>
+          <w:rFonts w:ascii="Arial" w:hAnsi="Arial" w:cs="Arial"/>
+          <w:b/>
+          <w:bCs/>
+          <w:color w:val="222222"/>
+          <w:shd w:val="clear" w:color="auto" w:fill="FFFFFF"/>
+        </w:rPr>
+      </w:pPr>
+    </w:p>
+    <w:p>
+      <w:pPr>
+        <w:rPr>
+          <w:rFonts w:ascii="Arial" w:hAnsi="Arial" w:cs="Arial"/>
+          <w:b/>
+          <w:bCs/>
+          <w:color w:val="222222"/>
+          <w:shd w:val="clear" w:color="auto" w:fill="FFFFFF"/>
+        </w:rPr>
+      </w:pPr>
+      <w:r>
+        <w:rPr>
+          <w:rFonts w:ascii="Arial" w:hAnsi="Arial" w:cs="Arial"/>
+          <w:b/>
+          <w:bCs/>
+          <w:color w:val="222222"/>
+          <w:shd w:val="clear" w:color="auto" w:fill="FFFFFF"/>
+        </w:rPr>
+        <w:t>L140 - LA-MC-ICP-MS?</w:t>
+      </w:r>
+    </w:p>
+    <w:p>
+      <w:pPr>
+        <w:rPr>
+          <w:rFonts w:ascii="Arial" w:hAnsi="Arial" w:cs="Arial"/>
+          <w:color w:val="222222"/>
+          <w:shd w:val="clear" w:color="auto" w:fill="FFFFFF"/>
+        </w:rPr>
+      </w:pPr>
+      <w:r>
+        <w:rPr>
+          <w:rFonts w:ascii="Arial" w:hAnsi="Arial" w:cs="Arial"/>
+          <w:color w:val="222222"/>
+          <w:shd w:val="clear" w:color="auto" w:fill="FFFFFF"/>
+        </w:rPr>
+        <w:t xml:space="preserve">Added MC (multi collector) to this acronym. </w:t>
+      </w:r>
+    </w:p>
+    <w:p>
+      <w:pPr>
+        <w:rPr>
+          <w:rFonts w:ascii="Arial" w:hAnsi="Arial" w:cs="Arial"/>
+          <w:b/>
+          <w:bCs/>
+          <w:color w:val="222222"/>
+          <w:shd w:val="clear" w:color="auto" w:fill="FFFFFF"/>
+        </w:rPr>
+      </w:pPr>
+      <w:r>
+        <w:rPr>
+          <w:rFonts w:ascii="Arial" w:hAnsi="Arial" w:cs="Arial"/>
+          <w:color w:val="222222"/>
+        </w:rPr>
+        <w:br/>
+      </w:r>
+      <w:r>
+        <w:rPr>
+          <w:rFonts w:ascii="Arial" w:hAnsi="Arial" w:cs="Arial"/>
+          <w:b/>
+          <w:bCs/>
+          <w:color w:val="222222"/>
+          <w:shd w:val="clear" w:color="auto" w:fill="FFFFFF"/>
+        </w:rPr>
+        <w:t xml:space="preserve">L. 160 – I think for unfamiliar readers, this can be explained better. Namely, that </w:t>
+      </w:r>
+      <w:r>
+        <w:rPr>
+          <w:rFonts w:ascii="Arial" w:hAnsi="Arial" w:cs="Arial"/>
+          <w:b/>
+          <w:bCs/>
+          <w:color w:val="222222"/>
+          <w:shd w:val="clear" w:color="auto" w:fill="FFFFFF"/>
+        </w:rPr>
         <w:lastRenderedPageBreak/>
-        <w:t>Minor edits</w:t>
-      </w:r>
-      <w:r>
-        <w:rPr>
-          <w:rFonts w:ascii="Arial" w:hAnsi="Arial" w:cs="Arial"/>
-          <w:color w:val="222222"/>
-        </w:rPr>
-        <w:br/>
-      </w:r>
-      <w:r>
-        <w:rPr>
-          <w:rFonts w:ascii="Arial" w:hAnsi="Arial" w:cs="Arial"/>
-          <w:b/>
-          <w:bCs/>
-          <w:color w:val="222222"/>
-          <w:shd w:val="clear" w:color="auto" w:fill="FFFFFF"/>
-        </w:rPr>
-        <w:t xml:space="preserve">L. 133– I assume </w:t>
-      </w:r>
-      <w:proofErr w:type="gramStart"/>
-      <w:r>
-        <w:rPr>
-          <w:rFonts w:ascii="Arial" w:hAnsi="Arial" w:cs="Arial"/>
-          <w:b/>
-          <w:bCs/>
-          <w:color w:val="222222"/>
-          <w:shd w:val="clear" w:color="auto" w:fill="FFFFFF"/>
-        </w:rPr>
-        <w:t>Bristol bay</w:t>
-      </w:r>
-      <w:proofErr w:type="gramEnd"/>
-      <w:r>
-        <w:rPr>
-          <w:rFonts w:ascii="Arial" w:hAnsi="Arial" w:cs="Arial"/>
-          <w:b/>
-          <w:bCs/>
-          <w:color w:val="222222"/>
-          <w:shd w:val="clear" w:color="auto" w:fill="FFFFFF"/>
-        </w:rPr>
-        <w:t xml:space="preserve"> is directly in the vicinity of the Nushagak – but maybe some added clarification will be beneficial to interpret that all Chinook salmon caught in Bristol Bay were returning to the Nushagak River.</w:t>
-      </w:r>
-    </w:p>
-    <w:p>
-      <w:pPr>
-        <w:rPr>
-          <w:rFonts w:ascii="Arial" w:hAnsi="Arial" w:cs="Arial"/>
-          <w:color w:val="222222"/>
-          <w:shd w:val="clear" w:color="auto" w:fill="FFFFFF"/>
-        </w:rPr>
-      </w:pPr>
-    </w:p>
-    <w:p>
-      <w:pPr>
-        <w:rPr>
-          <w:rFonts w:ascii="Arial" w:hAnsi="Arial" w:cs="Arial"/>
-          <w:color w:val="222222"/>
-          <w:shd w:val="clear" w:color="auto" w:fill="FFFFFF"/>
-        </w:rPr>
-      </w:pPr>
-      <w:r>
-        <w:rPr>
-          <w:rFonts w:ascii="Arial" w:hAnsi="Arial" w:cs="Arial"/>
-          <w:color w:val="222222"/>
-          <w:shd w:val="clear" w:color="auto" w:fill="FFFFFF"/>
-        </w:rPr>
-        <w:t xml:space="preserve">We added clarification and management document reference that nearly all Chinook salmon Caught in </w:t>
-      </w:r>
-      <w:proofErr w:type="gramStart"/>
-      <w:r>
-        <w:rPr>
-          <w:rFonts w:ascii="Arial" w:hAnsi="Arial" w:cs="Arial"/>
-          <w:color w:val="222222"/>
-          <w:shd w:val="clear" w:color="auto" w:fill="FFFFFF"/>
-        </w:rPr>
-        <w:t>the this</w:t>
-      </w:r>
-      <w:proofErr w:type="gramEnd"/>
-      <w:r>
-        <w:rPr>
-          <w:rFonts w:ascii="Arial" w:hAnsi="Arial" w:cs="Arial"/>
-          <w:color w:val="222222"/>
-          <w:shd w:val="clear" w:color="auto" w:fill="FFFFFF"/>
-        </w:rPr>
-        <w:t xml:space="preserve"> region </w:t>
-      </w:r>
-      <w:proofErr w:type="gramStart"/>
-      <w:r>
-        <w:rPr>
-          <w:rFonts w:ascii="Arial" w:hAnsi="Arial" w:cs="Arial"/>
-          <w:color w:val="222222"/>
-          <w:shd w:val="clear" w:color="auto" w:fill="FFFFFF"/>
-        </w:rPr>
-        <w:t>are</w:t>
-      </w:r>
-      <w:proofErr w:type="gramEnd"/>
-      <w:r>
-        <w:rPr>
-          <w:rFonts w:ascii="Arial" w:hAnsi="Arial" w:cs="Arial"/>
-          <w:color w:val="222222"/>
-          <w:shd w:val="clear" w:color="auto" w:fill="FFFFFF"/>
-        </w:rPr>
-        <w:t xml:space="preserve"> Nushagak Origin Fish. </w:t>
-      </w:r>
-    </w:p>
-    <w:p>
-      <w:pPr>
-        <w:rPr>
-          <w:rFonts w:ascii="Arial" w:hAnsi="Arial" w:cs="Arial"/>
-          <w:color w:val="222222"/>
-          <w:shd w:val="clear" w:color="auto" w:fill="FFFFFF"/>
-        </w:rPr>
-      </w:pPr>
-    </w:p>
-    <w:p>
-      <w:pPr>
-        <w:rPr>
-          <w:rFonts w:ascii="Arial" w:hAnsi="Arial" w:cs="Arial"/>
-          <w:b/>
-          <w:bCs/>
-          <w:color w:val="222222"/>
-          <w:shd w:val="clear" w:color="auto" w:fill="FFFFFF"/>
-        </w:rPr>
-      </w:pPr>
-      <w:r>
-        <w:rPr>
-          <w:rFonts w:ascii="Arial" w:hAnsi="Arial" w:cs="Arial"/>
-          <w:color w:val="222222"/>
-        </w:rPr>
-        <w:br/>
-      </w:r>
-      <w:r>
-        <w:rPr>
-          <w:rFonts w:ascii="Arial" w:hAnsi="Arial" w:cs="Arial"/>
-          <w:b/>
-          <w:bCs/>
-          <w:color w:val="222222"/>
-          <w:shd w:val="clear" w:color="auto" w:fill="FFFFFF"/>
-        </w:rPr>
-        <w:t>Check end of Line 150 - … outlined in Makhlouf et al.,2025 (West &amp; Dann, 2019).</w:t>
-      </w:r>
-      <w:r>
-        <w:rPr>
-          <w:rFonts w:ascii="Arial" w:hAnsi="Arial" w:cs="Arial"/>
-          <w:b/>
-          <w:bCs/>
-          <w:color w:val="222222"/>
-        </w:rPr>
-        <w:br/>
-      </w:r>
-    </w:p>
-    <w:p>
-      <w:pPr>
-        <w:rPr>
-          <w:rFonts w:ascii="Arial" w:hAnsi="Arial" w:cs="Arial"/>
-          <w:color w:val="222222"/>
-          <w:shd w:val="clear" w:color="auto" w:fill="FFFFFF"/>
-        </w:rPr>
-      </w:pPr>
-      <w:r>
-        <w:rPr>
-          <w:rFonts w:ascii="Arial" w:hAnsi="Arial" w:cs="Arial"/>
-          <w:color w:val="222222"/>
-          <w:shd w:val="clear" w:color="auto" w:fill="FFFFFF"/>
-        </w:rPr>
-        <w:t xml:space="preserve">This is corrected to be Makhlouf et al., 2025, where the methods are referenced. </w:t>
-      </w:r>
-    </w:p>
-    <w:p>
-      <w:pPr>
-        <w:rPr>
-          <w:rFonts w:ascii="Arial" w:hAnsi="Arial" w:cs="Arial"/>
-          <w:b/>
-          <w:bCs/>
-          <w:color w:val="222222"/>
-          <w:shd w:val="clear" w:color="auto" w:fill="FFFFFF"/>
-        </w:rPr>
-      </w:pPr>
-    </w:p>
-    <w:p>
-      <w:pPr>
-        <w:rPr>
-          <w:rFonts w:ascii="Arial" w:hAnsi="Arial" w:cs="Arial"/>
-          <w:b/>
-          <w:bCs/>
-          <w:color w:val="222222"/>
-          <w:shd w:val="clear" w:color="auto" w:fill="FFFFFF"/>
-        </w:rPr>
-      </w:pPr>
-      <w:r>
-        <w:rPr>
-          <w:rFonts w:ascii="Arial" w:hAnsi="Arial" w:cs="Arial"/>
-          <w:b/>
-          <w:bCs/>
-          <w:color w:val="222222"/>
-          <w:shd w:val="clear" w:color="auto" w:fill="FFFFFF"/>
-        </w:rPr>
-        <w:t>L140 - LA-MC-ICP-MS?</w:t>
-      </w:r>
-    </w:p>
-    <w:p>
-      <w:pPr>
-        <w:rPr>
-          <w:rFonts w:ascii="Arial" w:hAnsi="Arial" w:cs="Arial"/>
-          <w:color w:val="222222"/>
-          <w:shd w:val="clear" w:color="auto" w:fill="FFFFFF"/>
-        </w:rPr>
-      </w:pPr>
-      <w:r>
-        <w:rPr>
-          <w:rFonts w:ascii="Arial" w:hAnsi="Arial" w:cs="Arial"/>
-          <w:color w:val="222222"/>
-          <w:shd w:val="clear" w:color="auto" w:fill="FFFFFF"/>
-        </w:rPr>
-        <w:t xml:space="preserve">Added MC (multi collector) to this acronym. </w:t>
-      </w:r>
-    </w:p>
-    <w:p>
-      <w:pPr>
-        <w:rPr>
-          <w:rFonts w:ascii="Arial" w:hAnsi="Arial" w:cs="Arial"/>
-          <w:b/>
-          <w:bCs/>
-          <w:color w:val="222222"/>
-          <w:shd w:val="clear" w:color="auto" w:fill="FFFFFF"/>
-        </w:rPr>
-      </w:pPr>
-      <w:r>
-        <w:rPr>
-          <w:rFonts w:ascii="Arial" w:hAnsi="Arial" w:cs="Arial"/>
-          <w:color w:val="222222"/>
-        </w:rPr>
-        <w:br/>
-      </w:r>
-      <w:r>
-        <w:rPr>
-          <w:rFonts w:ascii="Arial" w:hAnsi="Arial" w:cs="Arial"/>
-          <w:b/>
-          <w:bCs/>
-          <w:color w:val="222222"/>
-          <w:shd w:val="clear" w:color="auto" w:fill="FFFFFF"/>
-        </w:rPr>
-        <w:t xml:space="preserve">L. 160 – I think for unfamiliar readers, this can be explained better. Namely, that early otolith growth can reflects egg environment from the mother (which may resemble marine Sr ratios), and </w:t>
+        <w:t xml:space="preserve">early otolith growth can reflects egg environment from the mother (which may resemble marine Sr ratios), and </w:t>
       </w:r>
       <w:proofErr w:type="spellStart"/>
       <w:r>
@@ -3790,25 +3891,247 @@
         <w:rPr>
           <w:rFonts w:ascii="Times New Roman" w:hAnsi="Times New Roman" w:cs="Times New Roman"/>
         </w:rPr>
-        <w:t xml:space="preserve"> close to that of </w:t>
+        <w:t xml:space="preserve"> close to that of the global marine value (~ 0.7091). As the juvenile develops, this signal transitions to reflect that of the natal freshwater rearing environment. </w:t>
       </w:r>
       <w:r>
         <w:rPr>
           <w:rFonts w:ascii="Times New Roman" w:hAnsi="Times New Roman" w:cs="Times New Roman"/>
         </w:rPr>
+        <w:t>To standardize all data to the same life history period full laser ablation datasets were trimmed to include only data between the onset of the natal origin region and the beginning of marine residence.</w:t>
+      </w:r>
+      <w:r>
+        <w:rPr>
+          <w:rFonts w:ascii="Times New Roman" w:hAnsi="Times New Roman" w:cs="Times New Roman"/>
+        </w:rPr>
+        <w:t>”</w:t>
+      </w:r>
+    </w:p>
+    <w:p>
+      <w:pPr>
+        <w:rPr>
+          <w:rFonts w:ascii="Arial" w:hAnsi="Arial" w:cs="Arial"/>
+          <w:color w:val="222222"/>
+          <w:shd w:val="clear" w:color="auto" w:fill="FFFFFF"/>
+        </w:rPr>
+      </w:pPr>
+      <w:r>
+        <w:rPr>
+          <w:rFonts w:ascii="Arial" w:hAnsi="Arial" w:cs="Arial"/>
+          <w:color w:val="222222"/>
+          <w:shd w:val="clear" w:color="auto" w:fill="FFFFFF"/>
+        </w:rPr>
+        <w:t xml:space="preserve">We also added a supplementary figure of a representative time series displaying the shift from the maternal signature and the selected natal origin region. </w:t>
+      </w:r>
+    </w:p>
+    <w:p>
+      <w:pPr>
+        <w:rPr>
+          <w:rFonts w:ascii="Arial" w:hAnsi="Arial" w:cs="Arial"/>
+          <w:b/>
+          <w:bCs/>
+          <w:color w:val="222222"/>
+          <w:shd w:val="clear" w:color="auto" w:fill="FFFFFF"/>
+        </w:rPr>
+      </w:pPr>
+      <w:r>
+        <w:rPr>
+          <w:rFonts w:ascii="Arial" w:hAnsi="Arial" w:cs="Arial"/>
+          <w:b/>
+          <w:bCs/>
+          <w:color w:val="222222"/>
+        </w:rPr>
+        <w:br/>
+      </w:r>
+      <w:r>
+        <w:rPr>
+          <w:rFonts w:ascii="Arial" w:hAnsi="Arial" w:cs="Arial"/>
+          <w:b/>
+          <w:bCs/>
+          <w:color w:val="222222"/>
+          <w:shd w:val="clear" w:color="auto" w:fill="FFFFFF"/>
+        </w:rPr>
+        <w:t>L.335 – check sentence.</w:t>
+      </w:r>
+      <w:r>
+        <w:rPr>
+          <w:rFonts w:ascii="Arial" w:hAnsi="Arial" w:cs="Arial"/>
+          <w:b/>
+          <w:bCs/>
+          <w:color w:val="222222"/>
+        </w:rPr>
+        <w:br/>
+      </w:r>
+    </w:p>
+    <w:p>
+      <w:pPr>
+        <w:rPr>
+          <w:rFonts w:ascii="Arial" w:hAnsi="Arial" w:cs="Arial"/>
+          <w:color w:val="222222"/>
+          <w:shd w:val="clear" w:color="auto" w:fill="FFFFFF"/>
+        </w:rPr>
+      </w:pPr>
+      <w:r>
+        <w:rPr>
+          <w:rFonts w:ascii="Arial" w:hAnsi="Arial" w:cs="Arial"/>
+          <w:color w:val="222222"/>
+          <w:shd w:val="clear" w:color="auto" w:fill="FFFFFF"/>
+        </w:rPr>
+        <w:t xml:space="preserve">Fixed typos in this </w:t>
+      </w:r>
+      <w:proofErr w:type="gramStart"/>
+      <w:r>
+        <w:rPr>
+          <w:rFonts w:ascii="Arial" w:hAnsi="Arial" w:cs="Arial"/>
+          <w:color w:val="222222"/>
+          <w:shd w:val="clear" w:color="auto" w:fill="FFFFFF"/>
+        </w:rPr>
+        <w:t>sentence :</w:t>
+      </w:r>
+      <w:proofErr w:type="gramEnd"/>
+      <w:r>
+        <w:rPr>
+          <w:rFonts w:ascii="Arial" w:hAnsi="Arial" w:cs="Arial"/>
+          <w:color w:val="222222"/>
+          <w:shd w:val="clear" w:color="auto" w:fill="FFFFFF"/>
+        </w:rPr>
+        <w:t xml:space="preserve"> </w:t>
+      </w:r>
+    </w:p>
+    <w:p>
+      <w:pPr>
+        <w:rPr>
+          <w:rFonts w:ascii="Arial" w:hAnsi="Arial" w:cs="Arial"/>
+          <w:color w:val="222222"/>
+          <w:shd w:val="clear" w:color="auto" w:fill="FFFFFF"/>
+        </w:rPr>
+      </w:pPr>
+    </w:p>
+    <w:p>
+      <w:pPr>
+        <w:rPr>
+          <w:rFonts w:ascii="Times New Roman" w:hAnsi="Times New Roman" w:cs="Times New Roman"/>
+        </w:rPr>
+      </w:pPr>
+      <w:r>
+        <w:rPr>
+          <w:rFonts w:ascii="Arial" w:hAnsi="Arial" w:cs="Arial"/>
+          <w:color w:val="222222"/>
+          <w:shd w:val="clear" w:color="auto" w:fill="FFFFFF"/>
+        </w:rPr>
+        <w:t>“</w:t>
+      </w:r>
+      <w:r>
+        <w:rPr>
+          <w:rFonts w:ascii="Times New Roman" w:hAnsi="Times New Roman" w:cs="Times New Roman"/>
+        </w:rPr>
+        <w:t>This reflects the declining number of individuals which can be accurately assigned by the model with an added requirement of a high probability value.</w:t>
+      </w:r>
+      <w:r>
+        <w:rPr>
+          <w:rFonts w:ascii="Times New Roman" w:hAnsi="Times New Roman" w:cs="Times New Roman"/>
+        </w:rPr>
+        <w:t>”</w:t>
+      </w:r>
+    </w:p>
+    <w:p>
+      <w:pPr>
+        <w:rPr>
+          <w:rFonts w:ascii="Arial" w:hAnsi="Arial" w:cs="Arial"/>
+          <w:color w:val="222222"/>
+          <w:shd w:val="clear" w:color="auto" w:fill="FFFFFF"/>
+        </w:rPr>
+      </w:pPr>
+    </w:p>
+    <w:p>
+      <w:pPr>
+        <w:rPr>
+          <w:rFonts w:ascii="Arial" w:hAnsi="Arial" w:cs="Arial"/>
+          <w:color w:val="222222"/>
+          <w:shd w:val="clear" w:color="auto" w:fill="FFFFFF"/>
+        </w:rPr>
+      </w:pPr>
+      <w:r>
+        <w:rPr>
+          <w:rFonts w:ascii="Arial" w:hAnsi="Arial" w:cs="Arial"/>
+          <w:b/>
+          <w:bCs/>
+          <w:color w:val="222222"/>
+          <w:shd w:val="clear" w:color="auto" w:fill="FFFFFF"/>
+        </w:rPr>
         <w:lastRenderedPageBreak/>
-        <w:t xml:space="preserve">the global marine value (~ 0.7091). As the juvenile develops, this signal transitions to reflect that of the natal freshwater rearing environment. </w:t>
-      </w:r>
-      <w:r>
-        <w:rPr>
-          <w:rFonts w:ascii="Times New Roman" w:hAnsi="Times New Roman" w:cs="Times New Roman"/>
-        </w:rPr>
-        <w:t>To standardize all data to the same life history period full laser ablation datasets were trimmed to include only data between the onset of the natal origin region and the beginning of marine residence.</w:t>
-      </w:r>
-      <w:r>
-        <w:rPr>
-          <w:rFonts w:ascii="Times New Roman" w:hAnsi="Times New Roman" w:cs="Times New Roman"/>
-        </w:rPr>
+        <w:t>L. 407 – check sentence.</w:t>
+      </w:r>
+      <w:r>
+        <w:rPr>
+          <w:rFonts w:ascii="Arial" w:hAnsi="Arial" w:cs="Arial"/>
+          <w:color w:val="222222"/>
+        </w:rPr>
+        <w:br/>
+      </w:r>
+    </w:p>
+    <w:p>
+      <w:pPr>
+        <w:rPr>
+          <w:rFonts w:ascii="Arial" w:hAnsi="Arial" w:cs="Arial"/>
+          <w:color w:val="222222"/>
+          <w:shd w:val="clear" w:color="auto" w:fill="FFFFFF"/>
+        </w:rPr>
+      </w:pPr>
+      <w:r>
+        <w:rPr>
+          <w:rFonts w:ascii="Arial" w:hAnsi="Arial" w:cs="Arial"/>
+          <w:color w:val="222222"/>
+          <w:shd w:val="clear" w:color="auto" w:fill="FFFFFF"/>
+        </w:rPr>
+        <w:t xml:space="preserve">Fixed the typo in this sentence; it now reads </w:t>
+      </w:r>
+    </w:p>
+    <w:p>
+      <w:pPr>
+        <w:rPr>
+          <w:rFonts w:ascii="Arial" w:hAnsi="Arial" w:cs="Arial"/>
+          <w:color w:val="222222"/>
+          <w:shd w:val="clear" w:color="auto" w:fill="FFFFFF"/>
+        </w:rPr>
+      </w:pPr>
+    </w:p>
+    <w:p>
+      <w:pPr>
+        <w:rPr>
+          <w:rFonts w:ascii="Arial" w:hAnsi="Arial" w:cs="Arial"/>
+          <w:color w:val="222222"/>
+          <w:shd w:val="clear" w:color="auto" w:fill="FFFFFF"/>
+        </w:rPr>
+      </w:pPr>
+      <w:r>
+        <w:rPr>
+          <w:rFonts w:ascii="Arial" w:hAnsi="Arial" w:cs="Arial"/>
+          <w:color w:val="222222"/>
+          <w:shd w:val="clear" w:color="auto" w:fill="FFFFFF"/>
+        </w:rPr>
+        <w:t>“</w:t>
+      </w:r>
+      <w:bookmarkStart w:id="0" w:name="_Hlk223339650"/>
+      <w:r>
+        <w:t xml:space="preserve">The workflow developed here illustrates an approach that can be used alongside otolith LA-ICPMS data to provide probabilistic estimates of provenance and </w:t>
+      </w:r>
+      <w:r>
+        <w:t xml:space="preserve">a </w:t>
+      </w:r>
+      <w:r>
+        <w:t xml:space="preserve">calibrated </w:t>
+      </w:r>
+      <w:r>
+        <w:t xml:space="preserve">classification model that , given further validation, can be used to </w:t>
+      </w:r>
+      <w:r>
+        <w:t>classify adult Chinook salmon from western Alaska watersheds</w:t>
+      </w:r>
+      <w:bookmarkEnd w:id="0"/>
+      <w:r>
+        <w:t>.</w:t>
+      </w:r>
+      <w:r>
         <w:t>”</w:t>
       </w:r>
     </w:p>
@@ -3820,122 +4143,6 @@
           <w:shd w:val="clear" w:color="auto" w:fill="FFFFFF"/>
         </w:rPr>
       </w:pPr>
-      <w:r>
-        <w:rPr>
-          <w:rFonts w:ascii="Arial" w:hAnsi="Arial" w:cs="Arial"/>
-          <w:color w:val="222222"/>
-          <w:shd w:val="clear" w:color="auto" w:fill="FFFFFF"/>
-        </w:rPr>
-        <w:t xml:space="preserve">We also added a supplementary figure of a representative time series displaying the shift from the maternal signature and the selected natal origin region. </w:t>
-      </w:r>
-    </w:p>
-    <w:p>
-      <w:pPr>
-        <w:rPr>
-          <w:rFonts w:ascii="Arial" w:hAnsi="Arial" w:cs="Arial"/>
-          <w:b/>
-          <w:bCs/>
-          <w:color w:val="222222"/>
-          <w:shd w:val="clear" w:color="auto" w:fill="FFFFFF"/>
-        </w:rPr>
-      </w:pPr>
-      <w:r>
-        <w:rPr>
-          <w:rFonts w:ascii="Arial" w:hAnsi="Arial" w:cs="Arial"/>
-          <w:b/>
-          <w:bCs/>
-          <w:color w:val="222222"/>
-        </w:rPr>
-        <w:br/>
-      </w:r>
-      <w:r>
-        <w:rPr>
-          <w:rFonts w:ascii="Arial" w:hAnsi="Arial" w:cs="Arial"/>
-          <w:b/>
-          <w:bCs/>
-          <w:color w:val="222222"/>
-          <w:shd w:val="clear" w:color="auto" w:fill="FFFFFF"/>
-        </w:rPr>
-        <w:t>L.335 – check sentence.</w:t>
-      </w:r>
-      <w:r>
-        <w:rPr>
-          <w:rFonts w:ascii="Arial" w:hAnsi="Arial" w:cs="Arial"/>
-          <w:b/>
-          <w:bCs/>
-          <w:color w:val="222222"/>
-        </w:rPr>
-        <w:br/>
-      </w:r>
-    </w:p>
-    <w:p>
-      <w:pPr>
-        <w:rPr>
-          <w:rFonts w:ascii="Arial" w:hAnsi="Arial" w:cs="Arial"/>
-          <w:color w:val="222222"/>
-          <w:shd w:val="clear" w:color="auto" w:fill="FFFFFF"/>
-        </w:rPr>
-      </w:pPr>
-      <w:r>
-        <w:rPr>
-          <w:rFonts w:ascii="Arial" w:hAnsi="Arial" w:cs="Arial"/>
-          <w:color w:val="222222"/>
-          <w:shd w:val="clear" w:color="auto" w:fill="FFFFFF"/>
-        </w:rPr>
-        <w:t>Check</w:t>
-      </w:r>
-    </w:p>
-    <w:p>
-      <w:pPr>
-        <w:rPr>
-          <w:rFonts w:ascii="Arial" w:hAnsi="Arial" w:cs="Arial"/>
-          <w:color w:val="222222"/>
-          <w:shd w:val="clear" w:color="auto" w:fill="FFFFFF"/>
-        </w:rPr>
-      </w:pPr>
-      <w:r>
-        <w:rPr>
-          <w:rFonts w:ascii="Arial" w:hAnsi="Arial" w:cs="Arial"/>
-          <w:b/>
-          <w:bCs/>
-          <w:color w:val="222222"/>
-          <w:shd w:val="clear" w:color="auto" w:fill="FFFFFF"/>
-        </w:rPr>
-        <w:t>L. 407 – check sentence.</w:t>
-      </w:r>
-      <w:r>
-        <w:rPr>
-          <w:rFonts w:ascii="Arial" w:hAnsi="Arial" w:cs="Arial"/>
-          <w:color w:val="222222"/>
-        </w:rPr>
-        <w:br/>
-      </w:r>
-    </w:p>
-    <w:p>
-      <w:pPr>
-        <w:rPr>
-          <w:rFonts w:ascii="Arial" w:hAnsi="Arial" w:cs="Arial"/>
-          <w:color w:val="222222"/>
-          <w:shd w:val="clear" w:color="auto" w:fill="FFFFFF"/>
-        </w:rPr>
-      </w:pPr>
-      <w:r>
-        <w:rPr>
-          <w:rFonts w:ascii="Arial" w:hAnsi="Arial" w:cs="Arial"/>
-          <w:color w:val="222222"/>
-          <w:shd w:val="clear" w:color="auto" w:fill="FFFFFF"/>
-        </w:rPr>
-        <w:t xml:space="preserve">Check </w:t>
-      </w:r>
-    </w:p>
-    <w:p>
-      <w:pPr>
-        <w:rPr>
-          <w:rFonts w:ascii="Arial" w:hAnsi="Arial" w:cs="Arial"/>
-          <w:color w:val="222222"/>
-          <w:shd w:val="clear" w:color="auto" w:fill="FFFFFF"/>
-        </w:rPr>
-      </w:pPr>
     </w:p>
     <w:p>
       <w:pPr>
@@ -3974,6 +4181,24 @@
         </w:rPr>
         <w:t xml:space="preserve">Check Order </w:t>
       </w:r>
+    </w:p>
+    <w:p>
+      <w:pPr>
+        <w:rPr>
+          <w:rFonts w:asciiTheme="majorHAnsi" w:hAnsiTheme="majorHAnsi" w:cs="Arial"/>
+          <w:color w:val="222222"/>
+          <w:shd w:val="clear" w:color="auto" w:fill="FFFFFF"/>
+        </w:rPr>
+      </w:pPr>
+    </w:p>
+    <w:p>
+      <w:pPr>
+        <w:rPr>
+          <w:rFonts w:asciiTheme="majorHAnsi" w:hAnsiTheme="majorHAnsi" w:cs="Arial"/>
+          <w:color w:val="222222"/>
+          <w:shd w:val="clear" w:color="auto" w:fill="FFFFFF"/>
+        </w:rPr>
+      </w:pPr>
     </w:p>
     <w:sectPr>
       <w:pgSz w:w="12240" w:h="15840"/>

</xml_diff>